<commit_message>
Day27-Capstone: guard GoalRefinerAgent's LLM call, fix Result nullability, add project.md
InvokePromptAsync was unguarded - a network hiccup, rate limit, or
content filter would crash the whole console session. Wraps it in
try/catch, leaving RefinedGoal at its safe default on failure. Also
gives ProjectTask.Result a "= string.Empty" default matching its
sibling string properties, closing a null-safety gap under nullable
reference types. Syncs the docx's Complete Code listing and replaces
missing.md with project.md.
</commit_message>
<xml_diff>
--- a/Day27-Capstone.docx
+++ b/Day27-Capstone.docx
@@ -105,19 +105,16 @@
         <w:ind w:left="1080"/>
       </w:pPr>
       <w:r>
-        <w:t>Note: The key is read from the `GEMINI_API_KEY` environment variable and the app throws immedia</w:t>
-      </w:r>
+        <w:t>Note: The key is read from the `GEMINI_API_KEY` environment variable and the app throws immediately if it's missing. This project introduces no plugins or tools yet — `GoalRefinerAgent` talks to the model with a single direct `kernel.InvokePromptAsync` call.</w:t>
+      </w:r>
+    </w:p>
+    <w:p/>
+    <w:p>
+      <w:pPr>
+        <w:pStyle w:val="Heading2"/>
+      </w:pPr>
       <w:r>
         <w:lastRenderedPageBreak/>
-        <w:t>tely if it's missing. This project introduces no plugins or tools yet — `GoalRefinerAgent` talks to the model with a single direct `kernel.InvokePromptAsync` call.</w:t>
-      </w:r>
-    </w:p>
-    <w:p/>
-    <w:p>
-      <w:pPr>
-        <w:pStyle w:val="Heading2"/>
-      </w:pPr>
-      <w:r>
         <w:t>3. Core Concepts Covered</w:t>
       </w:r>
     </w:p>
@@ -156,11 +153,7 @@
         <w:t>Interface-Driven Agent Contracts</w:t>
       </w:r>
       <w:r>
-        <w:t xml:space="preserve">: `IProjectAgent` defines the minimal shape (`Name`, `ExecuteAsync(ProjectState state)`) that every future specialist agent — Planner, Developer, Reviewer — must implement, so an orchestrator </w:t>
-      </w:r>
-      <w:r>
-        <w:lastRenderedPageBreak/>
-        <w:t>can eventually treat every agent identically regardless of what it actually does.</w:t>
+        <w:t>: `IProjectAgent` defines the minimal shape (`Name`, `ExecuteAsync(ProjectState state)`) that every future specialist agent — Planner, Developer, Reviewer — must implement, so an orchestrator can eventually treat every agent identically regardless of what it actually does.</w:t>
       </w:r>
     </w:p>
     <w:p>
@@ -217,11 +210,7 @@
         <w:t>Deterministic Output via Low Temperature</w:t>
       </w:r>
       <w:r>
-        <w:t>: `GoalRefinerAgent` sets `Temperature = 0.1` on its `GeminiPromptExecutionSettings`, favoring a consistent, professional rewrite of the user</w:t>
-      </w:r>
-      <w:r>
-        <w:lastRenderedPageBreak/>
-        <w:t>'s request over creative variation.</w:t>
+        <w:t>: `GoalRefinerAgent` sets `Temperature = 0.1` on its `GeminiPromptExecutionSettings`, favoring a consistent, professional rewrite of the user's request over creative variation.</w:t>
       </w:r>
     </w:p>
     <w:p>
@@ -447,471 +436,1583 @@
           <w:rFonts w:ascii="Consolas" w:hAnsi="Consolas"/>
           <w:sz w:val="19"/>
         </w:rPr>
+        <w:t xml:space="preserve">                ?? throw new Exception("GEMINI_API_KEY is missing");</w:t>
+      </w:r>
+    </w:p>
+    <w:p>
+      <w:pPr>
+        <w:pStyle w:val="NoSpacing"/>
+        <w:rPr>
+          <w:rFonts w:ascii="Consolas" w:hAnsi="Consolas"/>
+          <w:sz w:val="19"/>
+        </w:rPr>
+      </w:pPr>
+    </w:p>
+    <w:p>
+      <w:pPr>
+        <w:pStyle w:val="NoSpacing"/>
+        <w:rPr>
+          <w:rFonts w:ascii="Consolas" w:hAnsi="Consolas"/>
+          <w:sz w:val="19"/>
+        </w:rPr>
+      </w:pPr>
+      <w:r>
+        <w:rPr>
+          <w:rFonts w:ascii="Consolas" w:hAnsi="Consolas"/>
+          <w:sz w:val="19"/>
+        </w:rPr>
+        <w:t xml:space="preserve">            builder.AddGoogleAIGeminiChatCompletion("gemini-2.5-flash", apiKey);</w:t>
+      </w:r>
+    </w:p>
+    <w:p>
+      <w:pPr>
+        <w:pStyle w:val="NoSpacing"/>
+        <w:rPr>
+          <w:rFonts w:ascii="Consolas" w:hAnsi="Consolas"/>
+          <w:sz w:val="19"/>
+        </w:rPr>
+      </w:pPr>
+      <w:r>
+        <w:rPr>
+          <w:rFonts w:ascii="Consolas" w:hAnsi="Consolas"/>
+          <w:sz w:val="19"/>
+        </w:rPr>
+        <w:t xml:space="preserve">            Kernel kernel = builder.Build();</w:t>
+      </w:r>
+    </w:p>
+    <w:p>
+      <w:pPr>
+        <w:pStyle w:val="NoSpacing"/>
+        <w:rPr>
+          <w:rFonts w:ascii="Consolas" w:hAnsi="Consolas"/>
+          <w:sz w:val="19"/>
+        </w:rPr>
+      </w:pPr>
+    </w:p>
+    <w:p>
+      <w:pPr>
+        <w:pStyle w:val="NoSpacing"/>
+        <w:rPr>
+          <w:rFonts w:ascii="Consolas" w:hAnsi="Consolas"/>
+          <w:sz w:val="19"/>
+        </w:rPr>
+      </w:pPr>
+      <w:r>
+        <w:rPr>
+          <w:rFonts w:ascii="Consolas" w:hAnsi="Consolas"/>
+          <w:sz w:val="19"/>
+        </w:rPr>
+        <w:t xml:space="preserve">            Console.WriteLine("Universal Project Manager (UPM) Initialized");</w:t>
+      </w:r>
+    </w:p>
+    <w:p>
+      <w:pPr>
+        <w:pStyle w:val="NoSpacing"/>
+        <w:rPr>
+          <w:rFonts w:ascii="Consolas" w:hAnsi="Consolas"/>
+          <w:sz w:val="19"/>
+        </w:rPr>
+      </w:pPr>
+      <w:r>
+        <w:rPr>
+          <w:rFonts w:ascii="Consolas" w:hAnsi="Consolas"/>
+          <w:sz w:val="19"/>
+        </w:rPr>
+        <w:t xml:space="preserve">            Console.WriteLine("Architecture: Blackboard Pattern + Interface-Driven Agents");</w:t>
+      </w:r>
+    </w:p>
+    <w:p>
+      <w:pPr>
+        <w:pStyle w:val="NoSpacing"/>
+        <w:rPr>
+          <w:rFonts w:ascii="Consolas" w:hAnsi="Consolas"/>
+          <w:sz w:val="19"/>
+        </w:rPr>
+      </w:pPr>
+    </w:p>
+    <w:p>
+      <w:pPr>
+        <w:pStyle w:val="NoSpacing"/>
+        <w:rPr>
+          <w:rFonts w:ascii="Consolas" w:hAnsi="Consolas"/>
+          <w:sz w:val="19"/>
+        </w:rPr>
+      </w:pPr>
+      <w:r>
+        <w:rPr>
+          <w:rFonts w:ascii="Consolas" w:hAnsi="Consolas"/>
+          <w:sz w:val="19"/>
+        </w:rPr>
+        <w:t xml:space="preserve">            // Setup the Shared State</w:t>
+      </w:r>
+    </w:p>
+    <w:p>
+      <w:pPr>
+        <w:pStyle w:val="NoSpacing"/>
+        <w:rPr>
+          <w:rFonts w:ascii="Consolas" w:hAnsi="Consolas"/>
+          <w:sz w:val="19"/>
+        </w:rPr>
+      </w:pPr>
+      <w:r>
+        <w:rPr>
+          <w:rFonts w:ascii="Consolas" w:hAnsi="Consolas"/>
+          <w:sz w:val="19"/>
+        </w:rPr>
+        <w:t xml:space="preserve">            ProjectState projectState = new ProjectState();</w:t>
+      </w:r>
+    </w:p>
+    <w:p>
+      <w:pPr>
+        <w:pStyle w:val="NoSpacing"/>
+        <w:rPr>
+          <w:rFonts w:ascii="Consolas" w:hAnsi="Consolas"/>
+          <w:sz w:val="19"/>
+        </w:rPr>
+      </w:pPr>
+    </w:p>
+    <w:p>
+      <w:pPr>
+        <w:pStyle w:val="NoSpacing"/>
+        <w:rPr>
+          <w:rFonts w:ascii="Consolas" w:hAnsi="Consolas"/>
+          <w:sz w:val="19"/>
+        </w:rPr>
+      </w:pPr>
+      <w:r>
+        <w:rPr>
+          <w:rFonts w:ascii="Consolas" w:hAnsi="Consolas"/>
+          <w:sz w:val="19"/>
+        </w:rPr>
+        <w:t xml:space="preserve">            Console.Write("Enter a rough project idea:");</w:t>
+      </w:r>
+    </w:p>
+    <w:p>
+      <w:pPr>
+        <w:pStyle w:val="NoSpacing"/>
+        <w:rPr>
+          <w:rFonts w:ascii="Consolas" w:hAnsi="Consolas"/>
+          <w:sz w:val="19"/>
+        </w:rPr>
+      </w:pPr>
+      <w:r>
+        <w:rPr>
+          <w:rFonts w:ascii="Consolas" w:hAnsi="Consolas"/>
+          <w:sz w:val="19"/>
+        </w:rPr>
+        <w:t xml:space="preserve">            string originalRequest = Console.ReadLine() ?? string.Empty;</w:t>
+      </w:r>
+    </w:p>
+    <w:p>
+      <w:pPr>
+        <w:pStyle w:val="NoSpacing"/>
+        <w:rPr>
+          <w:rFonts w:ascii="Consolas" w:hAnsi="Consolas"/>
+          <w:sz w:val="19"/>
+        </w:rPr>
+      </w:pPr>
+      <w:r>
+        <w:rPr>
+          <w:rFonts w:ascii="Consolas" w:hAnsi="Consolas"/>
+          <w:sz w:val="19"/>
+        </w:rPr>
+        <w:t xml:space="preserve">            if (string.IsNullOrWhiteSpace(originalRequest)) return;</w:t>
+      </w:r>
+    </w:p>
+    <w:p>
+      <w:pPr>
+        <w:pStyle w:val="NoSpacing"/>
+        <w:rPr>
+          <w:rFonts w:ascii="Consolas" w:hAnsi="Consolas"/>
+          <w:sz w:val="19"/>
+        </w:rPr>
+      </w:pPr>
+    </w:p>
+    <w:p>
+      <w:pPr>
+        <w:pStyle w:val="NoSpacing"/>
+        <w:rPr>
+          <w:rFonts w:ascii="Consolas" w:hAnsi="Consolas"/>
+          <w:sz w:val="19"/>
+        </w:rPr>
+      </w:pPr>
+      <w:r>
+        <w:rPr>
+          <w:rFonts w:ascii="Consolas" w:hAnsi="Consolas"/>
+          <w:sz w:val="19"/>
+        </w:rPr>
+        <w:t xml:space="preserve">            projectState.OriginalRequest = originalRequest;</w:t>
+      </w:r>
+    </w:p>
+    <w:p>
+      <w:pPr>
+        <w:pStyle w:val="NoSpacing"/>
+        <w:rPr>
+          <w:rFonts w:ascii="Consolas" w:hAnsi="Consolas"/>
+          <w:sz w:val="19"/>
+        </w:rPr>
+      </w:pPr>
+    </w:p>
+    <w:p>
+      <w:pPr>
+        <w:pStyle w:val="NoSpacing"/>
+        <w:rPr>
+          <w:rFonts w:ascii="Consolas" w:hAnsi="Consolas"/>
+          <w:sz w:val="19"/>
+        </w:rPr>
+      </w:pPr>
+      <w:r>
+        <w:rPr>
+          <w:rFonts w:ascii="Consolas" w:hAnsi="Consolas"/>
+          <w:sz w:val="19"/>
+        </w:rPr>
+        <w:t xml:space="preserve">            // Initialize and Execute the Preliminary Agent</w:t>
+      </w:r>
+    </w:p>
+    <w:p>
+      <w:pPr>
+        <w:pStyle w:val="NoSpacing"/>
+        <w:rPr>
+          <w:rFonts w:ascii="Consolas" w:hAnsi="Consolas"/>
+          <w:sz w:val="19"/>
+        </w:rPr>
+      </w:pPr>
+      <w:r>
+        <w:rPr>
+          <w:rFonts w:ascii="Consolas" w:hAnsi="Consolas"/>
+          <w:sz w:val="19"/>
+        </w:rPr>
+        <w:t xml:space="preserve">            IProjectAgent refiner = new GoalRefinerAgent(kernel);</w:t>
+      </w:r>
+    </w:p>
+    <w:p>
+      <w:pPr>
+        <w:pStyle w:val="NoSpacing"/>
+        <w:rPr>
+          <w:rFonts w:ascii="Consolas" w:hAnsi="Consolas"/>
+          <w:sz w:val="19"/>
+        </w:rPr>
+      </w:pPr>
+    </w:p>
+    <w:p>
+      <w:pPr>
+        <w:pStyle w:val="NoSpacing"/>
+        <w:rPr>
+          <w:rFonts w:ascii="Consolas" w:hAnsi="Consolas"/>
+          <w:sz w:val="19"/>
+        </w:rPr>
+      </w:pPr>
+      <w:r>
+        <w:rPr>
+          <w:rFonts w:ascii="Consolas" w:hAnsi="Consolas"/>
+          <w:sz w:val="19"/>
+        </w:rPr>
+        <w:t xml:space="preserve">            Console.WriteLine($"\n[{refiner.Name.ToUpper()}] is processing the request...");</w:t>
+      </w:r>
+    </w:p>
+    <w:p>
+      <w:pPr>
+        <w:pStyle w:val="NoSpacing"/>
+        <w:rPr>
+          <w:rFonts w:ascii="Consolas" w:hAnsi="Consolas"/>
+          <w:sz w:val="19"/>
+        </w:rPr>
+      </w:pPr>
+      <w:r>
+        <w:rPr>
+          <w:rFonts w:ascii="Consolas" w:hAnsi="Consolas"/>
+          <w:sz w:val="19"/>
+        </w:rPr>
+        <w:t xml:space="preserve">            await refiner.ExecuteAsync(projectState);</w:t>
+      </w:r>
+    </w:p>
+    <w:p>
+      <w:pPr>
+        <w:pStyle w:val="NoSpacing"/>
+        <w:rPr>
+          <w:rFonts w:ascii="Consolas" w:hAnsi="Consolas"/>
+          <w:sz w:val="19"/>
+        </w:rPr>
+      </w:pPr>
+    </w:p>
+    <w:p>
+      <w:pPr>
+        <w:pStyle w:val="NoSpacing"/>
+        <w:rPr>
+          <w:rFonts w:ascii="Consolas" w:hAnsi="Consolas"/>
+          <w:sz w:val="19"/>
+        </w:rPr>
+      </w:pPr>
+      <w:r>
+        <w:rPr>
+          <w:rFonts w:ascii="Consolas" w:hAnsi="Consolas"/>
+          <w:sz w:val="19"/>
+        </w:rPr>
+        <w:t xml:space="preserve">            // Output the resulting Architecture state</w:t>
+      </w:r>
+    </w:p>
+    <w:p>
+      <w:pPr>
+        <w:pStyle w:val="NoSpacing"/>
+        <w:rPr>
+          <w:rFonts w:ascii="Consolas" w:hAnsi="Consolas"/>
+          <w:sz w:val="19"/>
+        </w:rPr>
+      </w:pPr>
+      <w:r>
+        <w:rPr>
+          <w:rFonts w:ascii="Consolas" w:hAnsi="Consolas"/>
+          <w:sz w:val="19"/>
+        </w:rPr>
+        <w:t xml:space="preserve">            Console.WriteLine("\n--- CURRENT PROJECT STATE ---");</w:t>
+      </w:r>
+    </w:p>
+    <w:p>
+      <w:pPr>
+        <w:pStyle w:val="NoSpacing"/>
+        <w:rPr>
+          <w:rFonts w:ascii="Consolas" w:hAnsi="Consolas"/>
+          <w:sz w:val="19"/>
+        </w:rPr>
+      </w:pPr>
+      <w:r>
+        <w:rPr>
+          <w:rFonts w:ascii="Consolas" w:hAnsi="Consolas"/>
+          <w:sz w:val="19"/>
+        </w:rPr>
+        <w:t xml:space="preserve">            Console.WriteLine($"Original : {projectState.OriginalRequest}");</w:t>
+      </w:r>
+    </w:p>
+    <w:p>
+      <w:pPr>
+        <w:pStyle w:val="NoSpacing"/>
+        <w:rPr>
+          <w:rFonts w:ascii="Consolas" w:hAnsi="Consolas"/>
+          <w:sz w:val="19"/>
+        </w:rPr>
+      </w:pPr>
+      <w:r>
+        <w:rPr>
+          <w:rFonts w:ascii="Consolas" w:hAnsi="Consolas"/>
+          <w:sz w:val="19"/>
+        </w:rPr>
+        <w:t xml:space="preserve">            Console.WriteLine($"Refined  : {projectState.RefinedGoal}");</w:t>
+      </w:r>
+    </w:p>
+    <w:p>
+      <w:pPr>
+        <w:pStyle w:val="NoSpacing"/>
+        <w:rPr>
+          <w:rFonts w:ascii="Consolas" w:hAnsi="Consolas"/>
+          <w:sz w:val="19"/>
+        </w:rPr>
+      </w:pPr>
+      <w:r>
+        <w:rPr>
+          <w:rFonts w:ascii="Consolas" w:hAnsi="Consolas"/>
+          <w:sz w:val="19"/>
+        </w:rPr>
+        <w:t xml:space="preserve">            Console.WriteLine($"Tasks    : {projectState.Tasks.Count} (Pending Generation)");</w:t>
+      </w:r>
+    </w:p>
+    <w:p>
+      <w:pPr>
+        <w:pStyle w:val="NoSpacing"/>
+        <w:rPr>
+          <w:rFonts w:ascii="Consolas" w:hAnsi="Consolas"/>
+          <w:sz w:val="19"/>
+        </w:rPr>
+      </w:pPr>
+      <w:r>
+        <w:rPr>
+          <w:rFonts w:ascii="Consolas" w:hAnsi="Consolas"/>
+          <w:sz w:val="19"/>
+        </w:rPr>
+        <w:t xml:space="preserve">            Console.WriteLine($"Complete : {projectState.IsFullyCompleted}");</w:t>
+      </w:r>
+    </w:p>
+    <w:p>
+      <w:pPr>
+        <w:pStyle w:val="NoSpacing"/>
+        <w:rPr>
+          <w:rFonts w:ascii="Consolas" w:hAnsi="Consolas"/>
+          <w:sz w:val="19"/>
+        </w:rPr>
+      </w:pPr>
+      <w:r>
+        <w:rPr>
+          <w:rFonts w:ascii="Consolas" w:hAnsi="Consolas"/>
+          <w:sz w:val="19"/>
+        </w:rPr>
+        <w:t xml:space="preserve">            Console.WriteLine("-----------------------------");</w:t>
+      </w:r>
+    </w:p>
+    <w:p>
+      <w:pPr>
+        <w:pStyle w:val="NoSpacing"/>
+        <w:rPr>
+          <w:rFonts w:ascii="Consolas" w:hAnsi="Consolas"/>
+          <w:sz w:val="19"/>
+        </w:rPr>
+      </w:pPr>
+      <w:r>
+        <w:rPr>
+          <w:rFonts w:ascii="Consolas" w:hAnsi="Consolas"/>
+          <w:sz w:val="19"/>
+        </w:rPr>
+        <w:t xml:space="preserve">            Console.WriteLine("\nArchitecture validated. Ready for Planners and Developers in Day 28.");</w:t>
+      </w:r>
+    </w:p>
+    <w:p>
+      <w:pPr>
+        <w:pStyle w:val="NoSpacing"/>
+        <w:rPr>
+          <w:rFonts w:ascii="Consolas" w:hAnsi="Consolas"/>
+          <w:sz w:val="19"/>
+        </w:rPr>
+      </w:pPr>
+      <w:r>
+        <w:rPr>
+          <w:rFonts w:ascii="Consolas" w:hAnsi="Consolas"/>
+          <w:sz w:val="19"/>
+        </w:rPr>
+        <w:t xml:space="preserve">        }</w:t>
+      </w:r>
+    </w:p>
+    <w:p>
+      <w:pPr>
+        <w:pStyle w:val="NoSpacing"/>
+        <w:rPr>
+          <w:rFonts w:ascii="Consolas" w:hAnsi="Consolas"/>
+          <w:sz w:val="19"/>
+        </w:rPr>
+      </w:pPr>
+      <w:r>
+        <w:rPr>
+          <w:rFonts w:ascii="Consolas" w:hAnsi="Consolas"/>
+          <w:sz w:val="19"/>
+        </w:rPr>
+        <w:t xml:space="preserve">    }</w:t>
+      </w:r>
+    </w:p>
+    <w:p>
+      <w:pPr>
+        <w:pStyle w:val="NoSpacing"/>
+        <w:rPr>
+          <w:rFonts w:ascii="Consolas" w:hAnsi="Consolas"/>
+          <w:sz w:val="19"/>
+        </w:rPr>
+      </w:pPr>
+      <w:r>
+        <w:rPr>
+          <w:rFonts w:ascii="Consolas" w:hAnsi="Consolas"/>
+          <w:sz w:val="19"/>
+        </w:rPr>
+        <w:t>}</w:t>
+      </w:r>
+    </w:p>
+    <w:p>
+      <w:pPr>
+        <w:rPr>
+          <w:b/>
+        </w:rPr>
+      </w:pPr>
+      <w:r>
+        <w:rPr>
+          <w:b/>
+        </w:rPr>
+        <w:t>GoalRefinerAgent.cs</w:t>
+      </w:r>
+    </w:p>
+    <w:p>
+      <w:pPr>
+        <w:pStyle w:val="NoSpacing"/>
+        <w:rPr>
+          <w:rFonts w:ascii="Consolas" w:hAnsi="Consolas"/>
+          <w:sz w:val="19"/>
+        </w:rPr>
+      </w:pPr>
+      <w:r>
+        <w:rPr>
+          <w:rFonts w:ascii="Consolas" w:hAnsi="Consolas"/>
+          <w:sz w:val="19"/>
+        </w:rPr>
+        <w:t>using Microsoft.SemanticKernel;</w:t>
+      </w:r>
+    </w:p>
+    <w:p>
+      <w:pPr>
+        <w:pStyle w:val="NoSpacing"/>
+        <w:rPr>
+          <w:rFonts w:ascii="Consolas" w:hAnsi="Consolas"/>
+          <w:sz w:val="19"/>
+        </w:rPr>
+      </w:pPr>
+      <w:r>
+        <w:rPr>
+          <w:rFonts w:ascii="Consolas" w:hAnsi="Consolas"/>
+          <w:sz w:val="19"/>
+        </w:rPr>
+        <w:t>using Microsoft.SemanticKernel.Connectors.Google;</w:t>
+      </w:r>
+    </w:p>
+    <w:p>
+      <w:pPr>
+        <w:pStyle w:val="NoSpacing"/>
+        <w:rPr>
+          <w:rFonts w:ascii="Consolas" w:hAnsi="Consolas"/>
+          <w:sz w:val="19"/>
+        </w:rPr>
+      </w:pPr>
+    </w:p>
+    <w:p>
+      <w:pPr>
+        <w:pStyle w:val="NoSpacing"/>
+        <w:rPr>
+          <w:rFonts w:ascii="Consolas" w:hAnsi="Consolas"/>
+          <w:sz w:val="19"/>
+        </w:rPr>
+      </w:pPr>
+      <w:r>
+        <w:rPr>
+          <w:rFonts w:ascii="Consolas" w:hAnsi="Consolas"/>
+          <w:sz w:val="19"/>
+        </w:rPr>
+        <w:t>namespace UniversalProjectManager</w:t>
+      </w:r>
+    </w:p>
+    <w:p>
+      <w:pPr>
+        <w:pStyle w:val="NoSpacing"/>
+        <w:rPr>
+          <w:rFonts w:ascii="Consolas" w:hAnsi="Consolas"/>
+          <w:sz w:val="19"/>
+        </w:rPr>
+      </w:pPr>
+      <w:r>
+        <w:rPr>
+          <w:rFonts w:ascii="Consolas" w:hAnsi="Consolas"/>
+          <w:sz w:val="19"/>
+        </w:rPr>
+        <w:t>{</w:t>
+      </w:r>
+    </w:p>
+    <w:p>
+      <w:pPr>
+        <w:pStyle w:val="NoSpacing"/>
+        <w:rPr>
+          <w:rFonts w:ascii="Consolas" w:hAnsi="Consolas"/>
+          <w:sz w:val="19"/>
+        </w:rPr>
+      </w:pPr>
+      <w:r>
+        <w:rPr>
+          <w:rFonts w:ascii="Consolas" w:hAnsi="Consolas"/>
+          <w:sz w:val="19"/>
+        </w:rPr>
+        <w:t xml:space="preserve">    /// &lt;summary&gt;</w:t>
+      </w:r>
+    </w:p>
+    <w:p>
+      <w:pPr>
+        <w:pStyle w:val="NoSpacing"/>
+        <w:rPr>
+          <w:rFonts w:ascii="Consolas" w:hAnsi="Consolas"/>
+          <w:sz w:val="19"/>
+        </w:rPr>
+      </w:pPr>
+      <w:r>
+        <w:rPr>
+          <w:rFonts w:ascii="Consolas" w:hAnsi="Consolas"/>
+          <w:sz w:val="19"/>
+        </w:rPr>
+        <w:t xml:space="preserve">    /// A preliminary agent responsible for taking a raw user input and converting it</w:t>
+      </w:r>
+    </w:p>
+    <w:p>
+      <w:pPr>
+        <w:pStyle w:val="NoSpacing"/>
+        <w:rPr>
+          <w:rFonts w:ascii="Consolas" w:hAnsi="Consolas"/>
+          <w:sz w:val="19"/>
+        </w:rPr>
+      </w:pPr>
+      <w:r>
+        <w:rPr>
+          <w:rFonts w:ascii="Consolas" w:hAnsi="Consolas"/>
+          <w:sz w:val="19"/>
+        </w:rPr>
+        <w:t xml:space="preserve">    /// into a professional, actionable project specification.</w:t>
+      </w:r>
+    </w:p>
+    <w:p>
+      <w:pPr>
+        <w:pStyle w:val="NoSpacing"/>
+        <w:rPr>
+          <w:rFonts w:ascii="Consolas" w:hAnsi="Consolas"/>
+          <w:sz w:val="19"/>
+        </w:rPr>
+      </w:pPr>
+      <w:r>
+        <w:rPr>
+          <w:rFonts w:ascii="Consolas" w:hAnsi="Consolas"/>
+          <w:sz w:val="19"/>
+        </w:rPr>
+        <w:t xml:space="preserve">    /// &lt;/summary&gt;</w:t>
+      </w:r>
+    </w:p>
+    <w:p>
+      <w:pPr>
+        <w:pStyle w:val="NoSpacing"/>
+        <w:rPr>
+          <w:rFonts w:ascii="Consolas" w:hAnsi="Consolas"/>
+          <w:sz w:val="19"/>
+        </w:rPr>
+      </w:pPr>
+      <w:r>
+        <w:rPr>
+          <w:rFonts w:ascii="Consolas" w:hAnsi="Consolas"/>
+          <w:sz w:val="19"/>
+        </w:rPr>
+        <w:t xml:space="preserve">    internal class GoalRefinerAgent : IProjectAgent</w:t>
+      </w:r>
+    </w:p>
+    <w:p>
+      <w:pPr>
+        <w:pStyle w:val="NoSpacing"/>
+        <w:rPr>
+          <w:rFonts w:ascii="Consolas" w:hAnsi="Consolas"/>
+          <w:sz w:val="19"/>
+        </w:rPr>
+      </w:pPr>
+      <w:r>
+        <w:rPr>
+          <w:rFonts w:ascii="Consolas" w:hAnsi="Consolas"/>
+          <w:sz w:val="19"/>
+        </w:rPr>
+        <w:t xml:space="preserve">    {</w:t>
+      </w:r>
+    </w:p>
+    <w:p>
+      <w:pPr>
+        <w:pStyle w:val="NoSpacing"/>
+        <w:rPr>
+          <w:rFonts w:ascii="Consolas" w:hAnsi="Consolas"/>
+          <w:sz w:val="19"/>
+        </w:rPr>
+      </w:pPr>
+      <w:r>
+        <w:rPr>
+          <w:rFonts w:ascii="Consolas" w:hAnsi="Consolas"/>
+          <w:sz w:val="19"/>
+        </w:rPr>
+        <w:t xml:space="preserve">        private readonly Kernel _kernel;</w:t>
+      </w:r>
+    </w:p>
+    <w:p>
+      <w:pPr>
+        <w:pStyle w:val="NoSpacing"/>
+        <w:rPr>
+          <w:rFonts w:ascii="Consolas" w:hAnsi="Consolas"/>
+          <w:sz w:val="19"/>
+        </w:rPr>
+      </w:pPr>
+      <w:r>
+        <w:rPr>
+          <w:rFonts w:ascii="Consolas" w:hAnsi="Consolas"/>
+          <w:sz w:val="19"/>
+        </w:rPr>
+        <w:t xml:space="preserve">        public string Name =&gt; "GoalRefiner";</w:t>
+      </w:r>
+    </w:p>
+    <w:p>
+      <w:pPr>
+        <w:pStyle w:val="NoSpacing"/>
+        <w:rPr>
+          <w:rFonts w:ascii="Consolas" w:hAnsi="Consolas"/>
+          <w:sz w:val="19"/>
+        </w:rPr>
+      </w:pPr>
+    </w:p>
+    <w:p>
+      <w:pPr>
+        <w:pStyle w:val="NoSpacing"/>
+        <w:rPr>
+          <w:rFonts w:ascii="Consolas" w:hAnsi="Consolas"/>
+          <w:sz w:val="19"/>
+        </w:rPr>
+      </w:pPr>
+      <w:r>
+        <w:rPr>
+          <w:rFonts w:ascii="Consolas" w:hAnsi="Consolas"/>
+          <w:sz w:val="19"/>
+        </w:rPr>
+        <w:t xml:space="preserve">        public GoalRefinerAgent(Kernel kernel)</w:t>
+      </w:r>
+    </w:p>
+    <w:p>
+      <w:pPr>
+        <w:pStyle w:val="NoSpacing"/>
+        <w:rPr>
+          <w:rFonts w:ascii="Consolas" w:hAnsi="Consolas"/>
+          <w:sz w:val="19"/>
+        </w:rPr>
+      </w:pPr>
+      <w:r>
+        <w:rPr>
+          <w:rFonts w:ascii="Consolas" w:hAnsi="Consolas"/>
+          <w:sz w:val="19"/>
+        </w:rPr>
+        <w:t xml:space="preserve">        {</w:t>
+      </w:r>
+    </w:p>
+    <w:p>
+      <w:pPr>
+        <w:pStyle w:val="NoSpacing"/>
+        <w:rPr>
+          <w:rFonts w:ascii="Consolas" w:hAnsi="Consolas"/>
+          <w:sz w:val="19"/>
+        </w:rPr>
+      </w:pPr>
+      <w:r>
+        <w:rPr>
+          <w:rFonts w:ascii="Consolas" w:hAnsi="Consolas"/>
+          <w:sz w:val="19"/>
+        </w:rPr>
+        <w:t xml:space="preserve">            _kernel = kernel;</w:t>
+      </w:r>
+    </w:p>
+    <w:p>
+      <w:pPr>
+        <w:pStyle w:val="NoSpacing"/>
+        <w:rPr>
+          <w:rFonts w:ascii="Consolas" w:hAnsi="Consolas"/>
+          <w:sz w:val="19"/>
+        </w:rPr>
+      </w:pPr>
+      <w:r>
+        <w:rPr>
+          <w:rFonts w:ascii="Consolas" w:hAnsi="Consolas"/>
+          <w:sz w:val="19"/>
+        </w:rPr>
+        <w:t xml:space="preserve">        }</w:t>
+      </w:r>
+    </w:p>
+    <w:p>
+      <w:pPr>
+        <w:pStyle w:val="NoSpacing"/>
+        <w:rPr>
+          <w:rFonts w:ascii="Consolas" w:hAnsi="Consolas"/>
+          <w:sz w:val="19"/>
+        </w:rPr>
+      </w:pPr>
+    </w:p>
+    <w:p>
+      <w:pPr>
+        <w:pStyle w:val="NoSpacing"/>
+        <w:rPr>
+          <w:rFonts w:ascii="Consolas" w:hAnsi="Consolas"/>
+          <w:sz w:val="19"/>
+        </w:rPr>
+      </w:pPr>
+      <w:r>
+        <w:rPr>
+          <w:rFonts w:ascii="Consolas" w:hAnsi="Consolas"/>
+          <w:sz w:val="19"/>
+        </w:rPr>
         <w:lastRenderedPageBreak/>
-        <w:t xml:space="preserve">                ?? throw new Exception("GEMINI_API_KEY is missing");</w:t>
-      </w:r>
-    </w:p>
-    <w:p>
-      <w:pPr>
-        <w:pStyle w:val="NoSpacing"/>
-        <w:rPr>
-          <w:rFonts w:ascii="Consolas" w:hAnsi="Consolas"/>
-          <w:sz w:val="19"/>
-        </w:rPr>
-      </w:pPr>
-    </w:p>
-    <w:p>
-      <w:pPr>
-        <w:pStyle w:val="NoSpacing"/>
-        <w:rPr>
-          <w:rFonts w:ascii="Consolas" w:hAnsi="Consolas"/>
-          <w:sz w:val="19"/>
-        </w:rPr>
-      </w:pPr>
-      <w:r>
-        <w:rPr>
-          <w:rFonts w:ascii="Consolas" w:hAnsi="Consolas"/>
-          <w:sz w:val="19"/>
-        </w:rPr>
-        <w:t xml:space="preserve">            builder.AddGoogleAIGeminiChatCompletion("gemini-2.5-flash", apiKey);</w:t>
-      </w:r>
-    </w:p>
-    <w:p>
-      <w:pPr>
-        <w:pStyle w:val="NoSpacing"/>
-        <w:rPr>
-          <w:rFonts w:ascii="Consolas" w:hAnsi="Consolas"/>
-          <w:sz w:val="19"/>
-        </w:rPr>
-      </w:pPr>
-      <w:r>
-        <w:rPr>
-          <w:rFonts w:ascii="Consolas" w:hAnsi="Consolas"/>
-          <w:sz w:val="19"/>
-        </w:rPr>
-        <w:t xml:space="preserve">            Kernel kernel = builder.Build();</w:t>
-      </w:r>
-    </w:p>
-    <w:p>
-      <w:pPr>
-        <w:pStyle w:val="NoSpacing"/>
-        <w:rPr>
-          <w:rFonts w:ascii="Consolas" w:hAnsi="Consolas"/>
-          <w:sz w:val="19"/>
-        </w:rPr>
-      </w:pPr>
-    </w:p>
-    <w:p>
-      <w:pPr>
-        <w:pStyle w:val="NoSpacing"/>
-        <w:rPr>
-          <w:rFonts w:ascii="Consolas" w:hAnsi="Consolas"/>
-          <w:sz w:val="19"/>
-        </w:rPr>
-      </w:pPr>
-      <w:r>
-        <w:rPr>
-          <w:rFonts w:ascii="Consolas" w:hAnsi="Consolas"/>
-          <w:sz w:val="19"/>
-        </w:rPr>
-        <w:t xml:space="preserve">            Console.WriteLine("Universal Project Manager (UPM) Initialized");</w:t>
-      </w:r>
-    </w:p>
-    <w:p>
-      <w:pPr>
-        <w:pStyle w:val="NoSpacing"/>
-        <w:rPr>
-          <w:rFonts w:ascii="Consolas" w:hAnsi="Consolas"/>
-          <w:sz w:val="19"/>
-        </w:rPr>
-      </w:pPr>
-      <w:r>
-        <w:rPr>
-          <w:rFonts w:ascii="Consolas" w:hAnsi="Consolas"/>
-          <w:sz w:val="19"/>
-        </w:rPr>
-        <w:t xml:space="preserve">            Console.WriteLine("Architecture: Blackboard Pattern + Interface-Driven Agents");</w:t>
-      </w:r>
-    </w:p>
-    <w:p>
-      <w:pPr>
-        <w:pStyle w:val="NoSpacing"/>
-        <w:rPr>
-          <w:rFonts w:ascii="Consolas" w:hAnsi="Consolas"/>
-          <w:sz w:val="19"/>
-        </w:rPr>
-      </w:pPr>
-    </w:p>
-    <w:p>
-      <w:pPr>
-        <w:pStyle w:val="NoSpacing"/>
-        <w:rPr>
-          <w:rFonts w:ascii="Consolas" w:hAnsi="Consolas"/>
-          <w:sz w:val="19"/>
-        </w:rPr>
-      </w:pPr>
-      <w:r>
-        <w:rPr>
-          <w:rFonts w:ascii="Consolas" w:hAnsi="Consolas"/>
-          <w:sz w:val="19"/>
-        </w:rPr>
-        <w:t xml:space="preserve">            // Setup the Shared State</w:t>
-      </w:r>
-    </w:p>
-    <w:p>
-      <w:pPr>
-        <w:pStyle w:val="NoSpacing"/>
-        <w:rPr>
-          <w:rFonts w:ascii="Consolas" w:hAnsi="Consolas"/>
-          <w:sz w:val="19"/>
-        </w:rPr>
-      </w:pPr>
-      <w:r>
-        <w:rPr>
-          <w:rFonts w:ascii="Consolas" w:hAnsi="Consolas"/>
-          <w:sz w:val="19"/>
-        </w:rPr>
-        <w:t xml:space="preserve">            ProjectState projectState = new ProjectState();</w:t>
-      </w:r>
-    </w:p>
-    <w:p>
-      <w:pPr>
-        <w:pStyle w:val="NoSpacing"/>
-        <w:rPr>
-          <w:rFonts w:ascii="Consolas" w:hAnsi="Consolas"/>
-          <w:sz w:val="19"/>
-        </w:rPr>
-      </w:pPr>
-    </w:p>
-    <w:p>
-      <w:pPr>
-        <w:pStyle w:val="NoSpacing"/>
-        <w:rPr>
-          <w:rFonts w:ascii="Consolas" w:hAnsi="Consolas"/>
-          <w:sz w:val="19"/>
-        </w:rPr>
-      </w:pPr>
-      <w:r>
-        <w:rPr>
-          <w:rFonts w:ascii="Consolas" w:hAnsi="Consolas"/>
-          <w:sz w:val="19"/>
-        </w:rPr>
-        <w:t xml:space="preserve">            Console.Write("Enter a rough project idea:");</w:t>
-      </w:r>
-    </w:p>
-    <w:p>
-      <w:pPr>
-        <w:pStyle w:val="NoSpacing"/>
-        <w:rPr>
-          <w:rFonts w:ascii="Consolas" w:hAnsi="Consolas"/>
-          <w:sz w:val="19"/>
-        </w:rPr>
-      </w:pPr>
-      <w:r>
-        <w:rPr>
-          <w:rFonts w:ascii="Consolas" w:hAnsi="Consolas"/>
-          <w:sz w:val="19"/>
-        </w:rPr>
-        <w:t xml:space="preserve">            string originalRequest = Console.ReadLine() ?? string.Empty;</w:t>
-      </w:r>
-    </w:p>
-    <w:p>
-      <w:pPr>
-        <w:pStyle w:val="NoSpacing"/>
-        <w:rPr>
-          <w:rFonts w:ascii="Consolas" w:hAnsi="Consolas"/>
-          <w:sz w:val="19"/>
-        </w:rPr>
-      </w:pPr>
-      <w:r>
-        <w:rPr>
-          <w:rFonts w:ascii="Consolas" w:hAnsi="Consolas"/>
-          <w:sz w:val="19"/>
-        </w:rPr>
-        <w:t xml:space="preserve">            if (string.IsNullOrWhiteSpace(originalRequest)) return;</w:t>
-      </w:r>
-    </w:p>
-    <w:p>
-      <w:pPr>
-        <w:pStyle w:val="NoSpacing"/>
-        <w:rPr>
-          <w:rFonts w:ascii="Consolas" w:hAnsi="Consolas"/>
-          <w:sz w:val="19"/>
-        </w:rPr>
-      </w:pPr>
-    </w:p>
-    <w:p>
-      <w:pPr>
-        <w:pStyle w:val="NoSpacing"/>
-        <w:rPr>
-          <w:rFonts w:ascii="Consolas" w:hAnsi="Consolas"/>
-          <w:sz w:val="19"/>
-        </w:rPr>
-      </w:pPr>
-      <w:r>
-        <w:rPr>
-          <w:rFonts w:ascii="Consolas" w:hAnsi="Consolas"/>
-          <w:sz w:val="19"/>
-        </w:rPr>
-        <w:t xml:space="preserve">            projectState.OriginalRequest = originalRequest;</w:t>
-      </w:r>
-    </w:p>
-    <w:p>
-      <w:pPr>
-        <w:pStyle w:val="NoSpacing"/>
-        <w:rPr>
-          <w:rFonts w:ascii="Consolas" w:hAnsi="Consolas"/>
-          <w:sz w:val="19"/>
-        </w:rPr>
-      </w:pPr>
-    </w:p>
-    <w:p>
-      <w:pPr>
-        <w:pStyle w:val="NoSpacing"/>
-        <w:rPr>
-          <w:rFonts w:ascii="Consolas" w:hAnsi="Consolas"/>
-          <w:sz w:val="19"/>
-        </w:rPr>
-      </w:pPr>
-      <w:r>
-        <w:rPr>
-          <w:rFonts w:ascii="Consolas" w:hAnsi="Consolas"/>
-          <w:sz w:val="19"/>
-        </w:rPr>
-        <w:t xml:space="preserve">            // Initialize and Execute the Preliminary Agent</w:t>
-      </w:r>
-    </w:p>
-    <w:p>
-      <w:pPr>
-        <w:pStyle w:val="NoSpacing"/>
-        <w:rPr>
-          <w:rFonts w:ascii="Consolas" w:hAnsi="Consolas"/>
-          <w:sz w:val="19"/>
-        </w:rPr>
-      </w:pPr>
-      <w:r>
-        <w:rPr>
-          <w:rFonts w:ascii="Consolas" w:hAnsi="Consolas"/>
-          <w:sz w:val="19"/>
-        </w:rPr>
-        <w:t xml:space="preserve">            IProjectAgent refiner = new GoalRefinerAge</w:t>
-      </w:r>
+        <w:t xml:space="preserve">        public async Task ExecuteAsync(ProjectState state)</w:t>
+      </w:r>
+    </w:p>
+    <w:p>
+      <w:pPr>
+        <w:pStyle w:val="NoSpacing"/>
+        <w:rPr>
+          <w:rFonts w:ascii="Consolas" w:hAnsi="Consolas"/>
+          <w:sz w:val="19"/>
+        </w:rPr>
+      </w:pPr>
+      <w:r>
+        <w:rPr>
+          <w:rFonts w:ascii="Consolas" w:hAnsi="Consolas"/>
+          <w:sz w:val="19"/>
+        </w:rPr>
+        <w:t xml:space="preserve">        {</w:t>
+      </w:r>
+    </w:p>
+    <w:p>
+      <w:pPr>
+        <w:pStyle w:val="NoSpacing"/>
+        <w:rPr>
+          <w:rFonts w:ascii="Consolas" w:hAnsi="Consolas"/>
+          <w:sz w:val="19"/>
+        </w:rPr>
+      </w:pPr>
+      <w:r>
+        <w:rPr>
+          <w:rFonts w:ascii="Consolas" w:hAnsi="Consolas"/>
+          <w:sz w:val="19"/>
+        </w:rPr>
+        <w:t xml:space="preserve">            // Use the kernel to refine the goal based on the original request</w:t>
+      </w:r>
+    </w:p>
+    <w:p>
+      <w:pPr>
+        <w:pStyle w:val="NoSpacing"/>
+        <w:rPr>
+          <w:rFonts w:ascii="Consolas" w:hAnsi="Consolas"/>
+          <w:sz w:val="19"/>
+        </w:rPr>
+      </w:pPr>
+      <w:r>
+        <w:rPr>
+          <w:rFonts w:ascii="Consolas" w:hAnsi="Consolas"/>
+          <w:sz w:val="19"/>
+        </w:rPr>
+        <w:t xml:space="preserve">            var prompt = $@"</w:t>
+      </w:r>
+    </w:p>
+    <w:p>
+      <w:pPr>
+        <w:pStyle w:val="NoSpacing"/>
+        <w:rPr>
+          <w:rFonts w:ascii="Consolas" w:hAnsi="Consolas"/>
+          <w:sz w:val="19"/>
+        </w:rPr>
+      </w:pPr>
+      <w:r>
+        <w:rPr>
+          <w:rFonts w:ascii="Consolas" w:hAnsi="Consolas"/>
+          <w:sz w:val="19"/>
+        </w:rPr>
+        <w:t xml:space="preserve">                You are a highly analytical Project Manager.</w:t>
+      </w:r>
+    </w:p>
+    <w:p>
+      <w:pPr>
+        <w:pStyle w:val="NoSpacing"/>
+        <w:rPr>
+          <w:rFonts w:ascii="Consolas" w:hAnsi="Consolas"/>
+          <w:sz w:val="19"/>
+        </w:rPr>
+      </w:pPr>
+      <w:r>
+        <w:rPr>
+          <w:rFonts w:ascii="Consolas" w:hAnsi="Consolas"/>
+          <w:sz w:val="19"/>
+        </w:rPr>
+        <w:t xml:space="preserve">                Take the user's raw request and refine it into a clear, 1-sentence technical goal.</w:t>
+      </w:r>
+    </w:p>
+    <w:p>
+      <w:pPr>
+        <w:pStyle w:val="NoSpacing"/>
+        <w:rPr>
+          <w:rFonts w:ascii="Consolas" w:hAnsi="Consolas"/>
+          <w:sz w:val="19"/>
+        </w:rPr>
+      </w:pPr>
+      <w:r>
+        <w:rPr>
+          <w:rFonts w:ascii="Consolas" w:hAnsi="Consolas"/>
+          <w:sz w:val="19"/>
+        </w:rPr>
+        <w:t xml:space="preserve">                Strip away conversational filler.</w:t>
+      </w:r>
+    </w:p>
+    <w:p>
+      <w:pPr>
+        <w:pStyle w:val="NoSpacing"/>
+        <w:rPr>
+          <w:rFonts w:ascii="Consolas" w:hAnsi="Consolas"/>
+          <w:sz w:val="19"/>
+        </w:rPr>
+      </w:pPr>
+    </w:p>
+    <w:p>
+      <w:pPr>
+        <w:pStyle w:val="NoSpacing"/>
+        <w:rPr>
+          <w:rFonts w:ascii="Consolas" w:hAnsi="Consolas"/>
+          <w:sz w:val="19"/>
+        </w:rPr>
+      </w:pPr>
+      <w:r>
+        <w:rPr>
+          <w:rFonts w:ascii="Consolas" w:hAnsi="Consolas"/>
+          <w:sz w:val="19"/>
+        </w:rPr>
+        <w:t xml:space="preserve">                RAW REQUEST: {state.OriginalRequest}</w:t>
+      </w:r>
+    </w:p>
+    <w:p>
+      <w:pPr>
+        <w:pStyle w:val="NoSpacing"/>
+        <w:rPr>
+          <w:rFonts w:ascii="Consolas" w:hAnsi="Consolas"/>
+          <w:sz w:val="19"/>
+        </w:rPr>
+      </w:pPr>
+      <w:r>
+        <w:rPr>
+          <w:rFonts w:ascii="Consolas" w:hAnsi="Consolas"/>
+          <w:sz w:val="19"/>
+        </w:rPr>
+        <w:t xml:space="preserve">                ".Trim();</w:t>
+      </w:r>
+    </w:p>
+    <w:p>
+      <w:pPr>
+        <w:pStyle w:val="NoSpacing"/>
+        <w:rPr>
+          <w:rFonts w:ascii="Consolas" w:hAnsi="Consolas"/>
+          <w:sz w:val="19"/>
+        </w:rPr>
+      </w:pPr>
+    </w:p>
+    <w:p>
+      <w:pPr>
+        <w:pStyle w:val="NoSpacing"/>
+        <w:rPr>
+          <w:rFonts w:ascii="Consolas" w:hAnsi="Consolas"/>
+          <w:sz w:val="19"/>
+        </w:rPr>
+      </w:pPr>
+      <w:r>
+        <w:rPr>
+          <w:rFonts w:ascii="Consolas" w:hAnsi="Consolas"/>
+          <w:sz w:val="19"/>
+        </w:rPr>
+        <w:t xml:space="preserve">            // Execute the prompt with a low temperature to ensure deterministic and professional output</w:t>
+      </w:r>
+    </w:p>
+    <w:p>
+      <w:pPr>
+        <w:pStyle w:val="NoSpacing"/>
+        <w:rPr>
+          <w:rFonts w:ascii="Consolas" w:hAnsi="Consolas"/>
+          <w:sz w:val="19"/>
+        </w:rPr>
+      </w:pPr>
+      <w:r>
+        <w:rPr>
+          <w:rFonts w:ascii="Consolas" w:hAnsi="Consolas"/>
+          <w:sz w:val="19"/>
+        </w:rPr>
+        <w:t xml:space="preserve">            var settings = new GeminiPromptExecutionSettings</w:t>
+      </w:r>
+    </w:p>
+    <w:p>
+      <w:pPr>
+        <w:pStyle w:val="NoSpacing"/>
+        <w:rPr>
+          <w:rFonts w:ascii="Consolas" w:hAnsi="Consolas"/>
+          <w:sz w:val="19"/>
+        </w:rPr>
+      </w:pPr>
+      <w:r>
+        <w:rPr>
+          <w:rFonts w:ascii="Consolas" w:hAnsi="Consolas"/>
+          <w:sz w:val="19"/>
+        </w:rPr>
+        <w:t xml:space="preserve">            {</w:t>
+      </w:r>
+    </w:p>
+    <w:p>
+      <w:pPr>
+        <w:pStyle w:val="NoSpacing"/>
+        <w:rPr>
+          <w:rFonts w:ascii="Consolas" w:hAnsi="Consolas"/>
+          <w:sz w:val="19"/>
+        </w:rPr>
+      </w:pPr>
+      <w:r>
+        <w:rPr>
+          <w:rFonts w:ascii="Consolas" w:hAnsi="Consolas"/>
+          <w:sz w:val="19"/>
+        </w:rPr>
+        <w:t xml:space="preserve">                Temperature = 0.1</w:t>
+      </w:r>
+    </w:p>
+    <w:p>
+      <w:pPr>
+        <w:pStyle w:val="NoSpacing"/>
+        <w:rPr>
+          <w:rFonts w:ascii="Consolas" w:hAnsi="Consolas"/>
+          <w:sz w:val="19"/>
+        </w:rPr>
+      </w:pPr>
+      <w:r>
+        <w:rPr>
+          <w:rFonts w:ascii="Consolas" w:hAnsi="Consolas"/>
+          <w:sz w:val="19"/>
+        </w:rPr>
+        <w:t xml:space="preserve">            };</w:t>
+      </w:r>
+    </w:p>
+    <w:p>
+      <w:pPr>
+        <w:pStyle w:val="NoSpacing"/>
+        <w:rPr>
+          <w:rFonts w:ascii="Consolas" w:hAnsi="Consolas"/>
+          <w:sz w:val="19"/>
+        </w:rPr>
+      </w:pPr>
+    </w:p>
+    <w:p>
+      <w:pPr>
+        <w:pStyle w:val="NoSpacing"/>
+        <w:rPr>
+          <w:rFonts w:ascii="Consolas" w:hAnsi="Consolas"/>
+          <w:sz w:val="19"/>
+        </w:rPr>
+      </w:pPr>
+      <w:r>
+        <w:rPr>
+          <w:rFonts w:ascii="Consolas" w:hAnsi="Consolas"/>
+          <w:sz w:val="19"/>
+        </w:rPr>
+        <w:t xml:space="preserve">            try</w:t>
+      </w:r>
+    </w:p>
+    <w:p>
+      <w:pPr>
+        <w:pStyle w:val="NoSpacing"/>
+        <w:rPr>
+          <w:rFonts w:ascii="Consolas" w:hAnsi="Consolas"/>
+          <w:sz w:val="19"/>
+        </w:rPr>
+      </w:pPr>
+      <w:r>
+        <w:rPr>
+          <w:rFonts w:ascii="Consolas" w:hAnsi="Consolas"/>
+          <w:sz w:val="19"/>
+        </w:rPr>
+        <w:t xml:space="preserve">            {</w:t>
+      </w:r>
+    </w:p>
+    <w:p>
+      <w:pPr>
+        <w:pStyle w:val="NoSpacing"/>
+        <w:rPr>
+          <w:rFonts w:ascii="Consolas" w:hAnsi="Consolas"/>
+          <w:sz w:val="19"/>
+        </w:rPr>
+      </w:pPr>
+      <w:r>
+        <w:rPr>
+          <w:rFonts w:ascii="Consolas" w:hAnsi="Consolas"/>
+          <w:sz w:val="19"/>
+        </w:rPr>
+        <w:t xml:space="preserve">                var result = await _kernel.InvokePromptAsync(prompt, new KernelArguments(settings));</w:t>
+      </w:r>
+    </w:p>
+    <w:p>
+      <w:pPr>
+        <w:pStyle w:val="NoSpacing"/>
+        <w:rPr>
+          <w:rFonts w:ascii="Consolas" w:hAnsi="Consolas"/>
+          <w:sz w:val="19"/>
+        </w:rPr>
+      </w:pPr>
+    </w:p>
+    <w:p>
+      <w:pPr>
+        <w:pStyle w:val="NoSpacing"/>
+        <w:rPr>
+          <w:rFonts w:ascii="Consolas" w:hAnsi="Consolas"/>
+          <w:sz w:val="19"/>
+        </w:rPr>
+      </w:pPr>
+      <w:r>
+        <w:rPr>
+          <w:rFonts w:ascii="Consolas" w:hAnsi="Consolas"/>
+          <w:sz w:val="19"/>
+        </w:rPr>
+        <w:t xml:space="preserve">                // Mutate the shared state with the refined goal</w:t>
+      </w:r>
+    </w:p>
+    <w:p>
+      <w:pPr>
+        <w:pStyle w:val="NoSpacing"/>
+        <w:rPr>
+          <w:rFonts w:ascii="Consolas" w:hAnsi="Consolas"/>
+          <w:sz w:val="19"/>
+        </w:rPr>
+      </w:pPr>
+      <w:r>
+        <w:rPr>
+          <w:rFonts w:ascii="Consolas" w:hAnsi="Consolas"/>
+          <w:sz w:val="19"/>
+        </w:rPr>
+        <w:t xml:space="preserve">                state.RefinedGoal = result.ToString().Trim();</w:t>
+      </w:r>
+    </w:p>
+    <w:p>
+      <w:pPr>
+        <w:pStyle w:val="NoSpacing"/>
+        <w:rPr>
+          <w:rFonts w:ascii="Consolas" w:hAnsi="Consolas"/>
+          <w:sz w:val="19"/>
+        </w:rPr>
+      </w:pPr>
+      <w:r>
+        <w:rPr>
+          <w:rFonts w:ascii="Consolas" w:hAnsi="Consolas"/>
+          <w:sz w:val="19"/>
+        </w:rPr>
+        <w:t xml:space="preserve">            }</w:t>
+      </w:r>
+    </w:p>
+    <w:p>
+      <w:pPr>
+        <w:pStyle w:val="NoSpacing"/>
+        <w:rPr>
+          <w:rFonts w:ascii="Consolas" w:hAnsi="Consolas"/>
+          <w:sz w:val="19"/>
+        </w:rPr>
+      </w:pPr>
+      <w:r>
+        <w:rPr>
+          <w:rFonts w:ascii="Consolas" w:hAnsi="Consolas"/>
+          <w:sz w:val="19"/>
+        </w:rPr>
+        <w:t xml:space="preserve">            catch (Exception ex)</w:t>
+      </w:r>
+    </w:p>
+    <w:p>
+      <w:pPr>
+        <w:pStyle w:val="NoSpacing"/>
+        <w:rPr>
+          <w:rFonts w:ascii="Consolas" w:hAnsi="Consolas"/>
+          <w:sz w:val="19"/>
+        </w:rPr>
+      </w:pPr>
+      <w:r>
+        <w:rPr>
+          <w:rFonts w:ascii="Consolas" w:hAnsi="Consolas"/>
+          <w:sz w:val="19"/>
+        </w:rPr>
+        <w:t xml:space="preserve">            {</w:t>
+      </w:r>
+    </w:p>
+    <w:p>
+      <w:pPr>
+        <w:pStyle w:val="NoSpacing"/>
+        <w:rPr>
+          <w:rFonts w:ascii="Consolas" w:hAnsi="Consolas"/>
+          <w:sz w:val="19"/>
+        </w:rPr>
+      </w:pPr>
+      <w:r>
+        <w:rPr>
+          <w:rFonts w:ascii="Consolas" w:hAnsi="Consolas"/>
+          <w:sz w:val="19"/>
+        </w:rPr>
+        <w:t xml:space="preserve">                // Step: a network hiccup, rate limit, or content filter here would otherwise crash</w:t>
+      </w:r>
+    </w:p>
+    <w:p>
+      <w:pPr>
+        <w:pStyle w:val="NoSpacing"/>
+        <w:rPr>
+          <w:rFonts w:ascii="Consolas" w:hAnsi="Consolas"/>
+          <w:sz w:val="19"/>
+        </w:rPr>
+      </w:pPr>
+      <w:r>
+        <w:rPr>
+          <w:rFonts w:ascii="Consolas" w:hAnsi="Consolas"/>
+          <w:sz w:val="19"/>
+        </w:rPr>
+        <w:t xml:space="preserve">                // the whole console session. Report it and leave RefinedGoal at its default instead.</w:t>
+      </w:r>
+    </w:p>
+    <w:p>
+      <w:pPr>
+        <w:pStyle w:val="NoSpacing"/>
+        <w:rPr>
+          <w:rFonts w:ascii="Consolas" w:hAnsi="Consolas"/>
+          <w:sz w:val="19"/>
+        </w:rPr>
+      </w:pPr>
+      <w:r>
+        <w:rPr>
+          <w:rFonts w:ascii="Consolas" w:hAnsi="Consolas"/>
+          <w:sz w:val="19"/>
+        </w:rPr>
+        <w:t xml:space="preserve">                Console.WriteLine($"[{Name}] Failed to refine goal: {ex.Message}");</w:t>
+      </w:r>
+    </w:p>
+    <w:p>
+      <w:pPr>
+        <w:pStyle w:val="NoSpacing"/>
+        <w:rPr>
+          <w:rFonts w:ascii="Consolas" w:hAnsi="Consolas"/>
+          <w:sz w:val="19"/>
+        </w:rPr>
+      </w:pPr>
+      <w:r>
+        <w:rPr>
+          <w:rFonts w:ascii="Consolas" w:hAnsi="Consolas"/>
+          <w:sz w:val="19"/>
+        </w:rPr>
+        <w:t xml:space="preserve">            }</w:t>
+      </w:r>
+    </w:p>
+    <w:p>
+      <w:pPr>
+        <w:pStyle w:val="NoSpacing"/>
+        <w:rPr>
+          <w:rFonts w:ascii="Consolas" w:hAnsi="Consolas"/>
+          <w:sz w:val="19"/>
+        </w:rPr>
+      </w:pPr>
+      <w:r>
+        <w:rPr>
+          <w:rFonts w:ascii="Consolas" w:hAnsi="Consolas"/>
+          <w:sz w:val="19"/>
+        </w:rPr>
+        <w:t xml:space="preserve">        }</w:t>
+      </w:r>
+    </w:p>
+    <w:p>
+      <w:pPr>
+        <w:pStyle w:val="NoSpacing"/>
+        <w:rPr>
+          <w:rFonts w:ascii="Consolas" w:hAnsi="Consolas"/>
+          <w:sz w:val="19"/>
+        </w:rPr>
+      </w:pPr>
+      <w:r>
+        <w:rPr>
+          <w:rFonts w:ascii="Consolas" w:hAnsi="Consolas"/>
+          <w:sz w:val="19"/>
+        </w:rPr>
+        <w:t xml:space="preserve">    }</w:t>
+      </w:r>
+    </w:p>
+    <w:p>
+      <w:pPr>
+        <w:pStyle w:val="NoSpacing"/>
+        <w:rPr>
+          <w:rFonts w:ascii="Consolas" w:hAnsi="Consolas"/>
+          <w:sz w:val="19"/>
+        </w:rPr>
+      </w:pPr>
+      <w:r>
+        <w:rPr>
+          <w:rFonts w:ascii="Consolas" w:hAnsi="Consolas"/>
+          <w:sz w:val="19"/>
+        </w:rPr>
+        <w:t>}</w:t>
+      </w:r>
+    </w:p>
+    <w:p>
+      <w:pPr>
+        <w:rPr>
+          <w:b/>
+        </w:rPr>
+      </w:pPr>
+      <w:r>
+        <w:rPr>
+          <w:b/>
+        </w:rPr>
+        <w:t>ProjectState.cs</w:t>
+      </w:r>
+    </w:p>
+    <w:p>
+      <w:pPr>
+        <w:pStyle w:val="NoSpacing"/>
+        <w:rPr>
+          <w:rFonts w:ascii="Consolas" w:hAnsi="Consolas"/>
+          <w:sz w:val="19"/>
+        </w:rPr>
+      </w:pPr>
+      <w:r>
+        <w:rPr>
+          <w:rFonts w:ascii="Consolas" w:hAnsi="Consolas"/>
+          <w:sz w:val="19"/>
+        </w:rPr>
+        <w:t>namespace UniversalProjectManager</w:t>
+      </w:r>
+    </w:p>
+    <w:p>
+      <w:pPr>
+        <w:pStyle w:val="NoSpacing"/>
+        <w:rPr>
+          <w:rFonts w:ascii="Consolas" w:hAnsi="Consolas"/>
+          <w:sz w:val="19"/>
+        </w:rPr>
+      </w:pPr>
+      <w:r>
+        <w:rPr>
+          <w:rFonts w:ascii="Consolas" w:hAnsi="Consolas"/>
+          <w:sz w:val="19"/>
+        </w:rPr>
+        <w:t>{</w:t>
+      </w:r>
+    </w:p>
+    <w:p>
+      <w:pPr>
+        <w:pStyle w:val="NoSpacing"/>
+        <w:rPr>
+          <w:rFonts w:ascii="Consolas" w:hAnsi="Consolas"/>
+          <w:sz w:val="19"/>
+        </w:rPr>
+      </w:pPr>
+      <w:r>
+        <w:rPr>
+          <w:rFonts w:ascii="Consolas" w:hAnsi="Consolas"/>
+          <w:sz w:val="19"/>
+        </w:rPr>
+        <w:t xml:space="preserve">    internal class ProjectState</w:t>
+      </w:r>
+    </w:p>
+    <w:p>
+      <w:pPr>
+        <w:pStyle w:val="NoSpacing"/>
+        <w:rPr>
+          <w:rFonts w:ascii="Consolas" w:hAnsi="Consolas"/>
+          <w:sz w:val="19"/>
+        </w:rPr>
+      </w:pPr>
+      <w:r>
+        <w:rPr>
+          <w:rFonts w:ascii="Consolas" w:hAnsi="Consolas"/>
+          <w:sz w:val="19"/>
+        </w:rPr>
+        <w:t xml:space="preserve">    {</w:t>
+      </w:r>
+    </w:p>
+    <w:p>
+      <w:pPr>
+        <w:pStyle w:val="NoSpacing"/>
+        <w:rPr>
+          <w:rFonts w:ascii="Consolas" w:hAnsi="Consolas"/>
+          <w:sz w:val="19"/>
+        </w:rPr>
+      </w:pPr>
+      <w:r>
+        <w:rPr>
+          <w:rFonts w:ascii="Consolas" w:hAnsi="Consolas"/>
+          <w:sz w:val="19"/>
+        </w:rPr>
+        <w:t xml:space="preserve">        public string OriginalRequest { get; set; } =string.Empty;</w:t>
+      </w:r>
+    </w:p>
+    <w:p>
+      <w:pPr>
+        <w:pStyle w:val="NoSpacing"/>
+        <w:rPr>
+          <w:rFonts w:ascii="Consolas" w:hAnsi="Consolas"/>
+          <w:sz w:val="19"/>
+        </w:rPr>
+      </w:pPr>
+      <w:r>
+        <w:rPr>
+          <w:rFonts w:ascii="Consolas" w:hAnsi="Consolas"/>
+          <w:sz w:val="19"/>
+        </w:rPr>
+        <w:t xml:space="preserve">        public string RefinedGoal { get; set; } = string.Empty;</w:t>
+      </w:r>
+    </w:p>
+    <w:p>
+      <w:pPr>
+        <w:pStyle w:val="NoSpacing"/>
+        <w:rPr>
+          <w:rFonts w:ascii="Consolas" w:hAnsi="Consolas"/>
+          <w:sz w:val="19"/>
+        </w:rPr>
+      </w:pPr>
+      <w:r>
+        <w:rPr>
+          <w:rFonts w:ascii="Consolas" w:hAnsi="Consolas"/>
+          <w:sz w:val="19"/>
+        </w:rPr>
+        <w:t xml:space="preserve">        public List&lt;ProjectTask&gt; Tasks { get; set; } = new List&lt;ProjectTask&gt;();</w:t>
+      </w:r>
+    </w:p>
+    <w:p>
+      <w:pPr>
+        <w:pStyle w:val="NoSpacing"/>
+        <w:rPr>
+          <w:rFonts w:ascii="Consolas" w:hAnsi="Consolas"/>
+          <w:sz w:val="19"/>
+        </w:rPr>
+      </w:pPr>
+      <w:r>
+        <w:rPr>
+          <w:rFonts w:ascii="Consolas" w:hAnsi="Consolas"/>
+          <w:sz w:val="19"/>
+        </w:rPr>
+        <w:t xml:space="preserve">        public bool IsFullyCompleted =&gt; Tasks.Any() &amp;&amp; Tasks.All(t =&gt; t.IsCompleted);</w:t>
+      </w:r>
+    </w:p>
+    <w:p>
+      <w:pPr>
+        <w:pStyle w:val="NoSpacing"/>
+        <w:rPr>
+          <w:rFonts w:ascii="Consolas" w:hAnsi="Consolas"/>
+          <w:sz w:val="19"/>
+        </w:rPr>
+      </w:pPr>
+      <w:r>
+        <w:rPr>
+          <w:rFonts w:ascii="Consolas" w:hAnsi="Consolas"/>
+          <w:sz w:val="19"/>
+        </w:rPr>
+        <w:t xml:space="preserve">    }</w:t>
+      </w:r>
+    </w:p>
+    <w:p>
+      <w:pPr>
+        <w:pStyle w:val="NoSpacing"/>
+        <w:rPr>
+          <w:rFonts w:ascii="Consolas" w:hAnsi="Consolas"/>
+          <w:sz w:val="19"/>
+        </w:rPr>
+      </w:pPr>
+      <w:r>
+        <w:rPr>
+          <w:rFonts w:ascii="Consolas" w:hAnsi="Consolas"/>
+          <w:sz w:val="19"/>
+        </w:rPr>
+        <w:t>}</w:t>
+      </w:r>
+    </w:p>
+    <w:p>
+      <w:pPr>
+        <w:rPr>
+          <w:b/>
+        </w:rPr>
+      </w:pPr>
+      <w:r>
+        <w:rPr>
+          <w:b/>
+        </w:rPr>
+        <w:t>IProjectAgent.cs</w:t>
+      </w:r>
+    </w:p>
+    <w:p>
+      <w:pPr>
+        <w:pStyle w:val="NoSpacing"/>
+        <w:rPr>
+          <w:rFonts w:ascii="Consolas" w:hAnsi="Consolas"/>
+          <w:sz w:val="19"/>
+        </w:rPr>
+      </w:pPr>
+      <w:r>
+        <w:rPr>
+          <w:rFonts w:ascii="Consolas" w:hAnsi="Consolas"/>
+          <w:sz w:val="19"/>
+        </w:rPr>
+        <w:t>namespace UniversalProjectManager</w:t>
+      </w:r>
+    </w:p>
+    <w:p>
+      <w:pPr>
+        <w:pStyle w:val="NoSpacing"/>
+        <w:rPr>
+          <w:rFonts w:ascii="Consolas" w:hAnsi="Consolas"/>
+          <w:sz w:val="19"/>
+        </w:rPr>
+      </w:pPr>
+      <w:r>
+        <w:rPr>
+          <w:rFonts w:ascii="Consolas" w:hAnsi="Consolas"/>
+          <w:sz w:val="19"/>
+        </w:rPr>
+        <w:t>{</w:t>
+      </w:r>
+    </w:p>
+    <w:p>
+      <w:pPr>
+        <w:pStyle w:val="NoSpacing"/>
+        <w:rPr>
+          <w:rFonts w:ascii="Consolas" w:hAnsi="Consolas"/>
+          <w:sz w:val="19"/>
+        </w:rPr>
+      </w:pPr>
+      <w:r>
+        <w:rPr>
+          <w:rFonts w:ascii="Consolas" w:hAnsi="Consolas"/>
+          <w:sz w:val="19"/>
+        </w:rPr>
+        <w:t xml:space="preserve">    internal interface IProjectAgent</w:t>
+      </w:r>
+    </w:p>
+    <w:p>
+      <w:pPr>
+        <w:pStyle w:val="NoSpacing"/>
+        <w:rPr>
+          <w:rFonts w:ascii="Consolas" w:hAnsi="Consolas"/>
+          <w:sz w:val="19"/>
+        </w:rPr>
+      </w:pPr>
+      <w:r>
+        <w:rPr>
+          <w:rFonts w:ascii="Consolas" w:hAnsi="Consolas"/>
+          <w:sz w:val="19"/>
+        </w:rPr>
+        <w:t xml:space="preserve">    {</w:t>
+      </w:r>
+    </w:p>
+    <w:p>
+      <w:pPr>
+        <w:pStyle w:val="NoSpacing"/>
+        <w:rPr>
+          <w:rFonts w:ascii="Consolas" w:hAnsi="Consolas"/>
+          <w:sz w:val="19"/>
+        </w:rPr>
+      </w:pPr>
+      <w:r>
+        <w:rPr>
+          <w:rFonts w:ascii="Consolas" w:hAnsi="Consolas"/>
+          <w:sz w:val="19"/>
+        </w:rPr>
+        <w:t xml:space="preserve">        string Name { get; }</w:t>
+      </w:r>
+    </w:p>
+    <w:p>
+      <w:pPr>
+        <w:pStyle w:val="NoSpacing"/>
+        <w:rPr>
+          <w:rFonts w:ascii="Consolas" w:hAnsi="Consolas"/>
+          <w:sz w:val="19"/>
+        </w:rPr>
+      </w:pPr>
+    </w:p>
+    <w:p>
+      <w:pPr>
+        <w:pStyle w:val="NoSpacing"/>
+        <w:rPr>
+          <w:rFonts w:ascii="Consolas" w:hAnsi="Consolas"/>
+          <w:sz w:val="19"/>
+        </w:rPr>
+      </w:pPr>
+      <w:r>
+        <w:rPr>
+          <w:rFonts w:ascii="Consolas" w:hAnsi="Consolas"/>
+          <w:sz w:val="19"/>
+        </w:rPr>
+        <w:t xml:space="preserve">        Task ExecuteAsync(ProjectState state);</w:t>
+      </w:r>
+    </w:p>
+    <w:p>
+      <w:pPr>
+        <w:pStyle w:val="NoSpacing"/>
+        <w:rPr>
+          <w:rFonts w:ascii="Consolas" w:hAnsi="Consolas"/>
+          <w:sz w:val="19"/>
+        </w:rPr>
+      </w:pPr>
       <w:r>
         <w:rPr>
           <w:rFonts w:ascii="Consolas" w:hAnsi="Consolas"/>
           <w:sz w:val="19"/>
         </w:rPr>
         <w:lastRenderedPageBreak/>
-        <w:t>nt(kernel);</w:t>
-      </w:r>
-    </w:p>
-    <w:p>
-      <w:pPr>
-        <w:pStyle w:val="NoSpacing"/>
-        <w:rPr>
-          <w:rFonts w:ascii="Consolas" w:hAnsi="Consolas"/>
-          <w:sz w:val="19"/>
-        </w:rPr>
-      </w:pPr>
-    </w:p>
-    <w:p>
-      <w:pPr>
-        <w:pStyle w:val="NoSpacing"/>
-        <w:rPr>
-          <w:rFonts w:ascii="Consolas" w:hAnsi="Consolas"/>
-          <w:sz w:val="19"/>
-        </w:rPr>
-      </w:pPr>
-      <w:r>
-        <w:rPr>
-          <w:rFonts w:ascii="Consolas" w:hAnsi="Consolas"/>
-          <w:sz w:val="19"/>
-        </w:rPr>
-        <w:t xml:space="preserve">            Console.WriteLine($"\n[{refiner.Name.ToUpper()}] is processing the request...");</w:t>
-      </w:r>
-    </w:p>
-    <w:p>
-      <w:pPr>
-        <w:pStyle w:val="NoSpacing"/>
-        <w:rPr>
-          <w:rFonts w:ascii="Consolas" w:hAnsi="Consolas"/>
-          <w:sz w:val="19"/>
-        </w:rPr>
-      </w:pPr>
-      <w:r>
-        <w:rPr>
-          <w:rFonts w:ascii="Consolas" w:hAnsi="Consolas"/>
-          <w:sz w:val="19"/>
-        </w:rPr>
-        <w:t xml:space="preserve">            await refiner.ExecuteAsync(projectState);</w:t>
-      </w:r>
-    </w:p>
-    <w:p>
-      <w:pPr>
-        <w:pStyle w:val="NoSpacing"/>
-        <w:rPr>
-          <w:rFonts w:ascii="Consolas" w:hAnsi="Consolas"/>
-          <w:sz w:val="19"/>
-        </w:rPr>
-      </w:pPr>
-    </w:p>
-    <w:p>
-      <w:pPr>
-        <w:pStyle w:val="NoSpacing"/>
-        <w:rPr>
-          <w:rFonts w:ascii="Consolas" w:hAnsi="Consolas"/>
-          <w:sz w:val="19"/>
-        </w:rPr>
-      </w:pPr>
-      <w:r>
-        <w:rPr>
-          <w:rFonts w:ascii="Consolas" w:hAnsi="Consolas"/>
-          <w:sz w:val="19"/>
-        </w:rPr>
-        <w:t xml:space="preserve">            // Output the resulting Architecture state</w:t>
-      </w:r>
-    </w:p>
-    <w:p>
-      <w:pPr>
-        <w:pStyle w:val="NoSpacing"/>
-        <w:rPr>
-          <w:rFonts w:ascii="Consolas" w:hAnsi="Consolas"/>
-          <w:sz w:val="19"/>
-        </w:rPr>
-      </w:pPr>
-      <w:r>
-        <w:rPr>
-          <w:rFonts w:ascii="Consolas" w:hAnsi="Consolas"/>
-          <w:sz w:val="19"/>
-        </w:rPr>
-        <w:t xml:space="preserve">            Console.WriteLine("\n--- CURRENT PROJECT STATE ---");</w:t>
-      </w:r>
-    </w:p>
-    <w:p>
-      <w:pPr>
-        <w:pStyle w:val="NoSpacing"/>
-        <w:rPr>
-          <w:rFonts w:ascii="Consolas" w:hAnsi="Consolas"/>
-          <w:sz w:val="19"/>
-        </w:rPr>
-      </w:pPr>
-      <w:r>
-        <w:rPr>
-          <w:rFonts w:ascii="Consolas" w:hAnsi="Consolas"/>
-          <w:sz w:val="19"/>
-        </w:rPr>
-        <w:t xml:space="preserve">            Console.WriteLine($"Original : {projectState.OriginalRequest}");</w:t>
-      </w:r>
-    </w:p>
-    <w:p>
-      <w:pPr>
-        <w:pStyle w:val="NoSpacing"/>
-        <w:rPr>
-          <w:rFonts w:ascii="Consolas" w:hAnsi="Consolas"/>
-          <w:sz w:val="19"/>
-        </w:rPr>
-      </w:pPr>
-      <w:r>
-        <w:rPr>
-          <w:rFonts w:ascii="Consolas" w:hAnsi="Consolas"/>
-          <w:sz w:val="19"/>
-        </w:rPr>
-        <w:t xml:space="preserve">            Console.WriteLine($"Refined  : {projectState.RefinedGoal}");</w:t>
-      </w:r>
-    </w:p>
-    <w:p>
-      <w:pPr>
-        <w:pStyle w:val="NoSpacing"/>
-        <w:rPr>
-          <w:rFonts w:ascii="Consolas" w:hAnsi="Consolas"/>
-          <w:sz w:val="19"/>
-        </w:rPr>
-      </w:pPr>
-      <w:r>
-        <w:rPr>
-          <w:rFonts w:ascii="Consolas" w:hAnsi="Consolas"/>
-          <w:sz w:val="19"/>
-        </w:rPr>
-        <w:t xml:space="preserve">            Console.WriteLine($"Tasks    : {projectState.Tasks.Count} (Pending Generation)");</w:t>
-      </w:r>
-    </w:p>
-    <w:p>
-      <w:pPr>
-        <w:pStyle w:val="NoSpacing"/>
-        <w:rPr>
-          <w:rFonts w:ascii="Consolas" w:hAnsi="Consolas"/>
-          <w:sz w:val="19"/>
-        </w:rPr>
-      </w:pPr>
-      <w:r>
-        <w:rPr>
-          <w:rFonts w:ascii="Consolas" w:hAnsi="Consolas"/>
-          <w:sz w:val="19"/>
-        </w:rPr>
-        <w:t xml:space="preserve">            Console.WriteLine($"Complete : {projectState.IsFullyCompleted}");</w:t>
-      </w:r>
-    </w:p>
-    <w:p>
-      <w:pPr>
-        <w:pStyle w:val="NoSpacing"/>
-        <w:rPr>
-          <w:rFonts w:ascii="Consolas" w:hAnsi="Consolas"/>
-          <w:sz w:val="19"/>
-        </w:rPr>
-      </w:pPr>
-      <w:r>
-        <w:rPr>
-          <w:rFonts w:ascii="Consolas" w:hAnsi="Consolas"/>
-          <w:sz w:val="19"/>
-        </w:rPr>
-        <w:t xml:space="preserve">            Console.WriteLine("-----------------------------");</w:t>
-      </w:r>
-    </w:p>
-    <w:p>
-      <w:pPr>
-        <w:pStyle w:val="NoSpacing"/>
-        <w:rPr>
-          <w:rFonts w:ascii="Consolas" w:hAnsi="Consolas"/>
-          <w:sz w:val="19"/>
-        </w:rPr>
-      </w:pPr>
-      <w:r>
-        <w:rPr>
-          <w:rFonts w:ascii="Consolas" w:hAnsi="Consolas"/>
-          <w:sz w:val="19"/>
-        </w:rPr>
-        <w:t xml:space="preserve">            Console.WriteLine("\nArchitecture validated. Ready for Planners and Developers in Day 28.");</w:t>
-      </w:r>
-    </w:p>
-    <w:p>
-      <w:pPr>
-        <w:pStyle w:val="NoSpacing"/>
-        <w:rPr>
-          <w:rFonts w:ascii="Consolas" w:hAnsi="Consolas"/>
-          <w:sz w:val="19"/>
-        </w:rPr>
-      </w:pPr>
-      <w:r>
-        <w:rPr>
-          <w:rFonts w:ascii="Consolas" w:hAnsi="Consolas"/>
-          <w:sz w:val="19"/>
-        </w:rPr>
-        <w:t xml:space="preserve">        }</w:t>
-      </w:r>
-    </w:p>
-    <w:p>
-      <w:pPr>
-        <w:pStyle w:val="NoSpacing"/>
-        <w:rPr>
-          <w:rFonts w:ascii="Consolas" w:hAnsi="Consolas"/>
-          <w:sz w:val="19"/>
-        </w:rPr>
-      </w:pPr>
-      <w:r>
-        <w:rPr>
-          <w:rFonts w:ascii="Consolas" w:hAnsi="Consolas"/>
-          <w:sz w:val="19"/>
-        </w:rPr>
         <w:t xml:space="preserve">    }</w:t>
       </w:r>
     </w:p>
@@ -941,49 +2042,8 @@
         <w:rPr>
           <w:b/>
         </w:rPr>
-        <w:t>GoalRefinerAgent.cs</w:t>
-      </w:r>
-    </w:p>
-    <w:p>
-      <w:pPr>
-        <w:pStyle w:val="NoSpacing"/>
-        <w:rPr>
-          <w:rFonts w:ascii="Consolas" w:hAnsi="Consolas"/>
-          <w:sz w:val="19"/>
-        </w:rPr>
-      </w:pPr>
-      <w:r>
-        <w:rPr>
-          <w:rFonts w:ascii="Consolas" w:hAnsi="Consolas"/>
-          <w:sz w:val="19"/>
-        </w:rPr>
-        <w:t>using Microsoft.SemanticKernel;</w:t>
-      </w:r>
-    </w:p>
-    <w:p>
-      <w:pPr>
-        <w:pStyle w:val="NoSpacing"/>
-        <w:rPr>
-          <w:rFonts w:ascii="Consolas" w:hAnsi="Consolas"/>
-          <w:sz w:val="19"/>
-        </w:rPr>
-      </w:pPr>
-      <w:r>
-        <w:rPr>
-          <w:rFonts w:ascii="Consolas" w:hAnsi="Consolas"/>
-          <w:sz w:val="19"/>
-        </w:rPr>
-        <w:t>using Microsoft.SemanticKernel.Connectors.Google;</w:t>
-      </w:r>
-    </w:p>
-    <w:p>
-      <w:pPr>
-        <w:pStyle w:val="NoSpacing"/>
-        <w:rPr>
-          <w:rFonts w:ascii="Consolas" w:hAnsi="Consolas"/>
-          <w:sz w:val="19"/>
-        </w:rPr>
-      </w:pPr>
+        <w:t>ProjectTask.cs</w:t>
+      </w:r>
     </w:p>
     <w:p>
       <w:pPr>
@@ -1030,71 +2090,7 @@
           <w:rFonts w:ascii="Consolas" w:hAnsi="Consolas"/>
           <w:sz w:val="19"/>
         </w:rPr>
-        <w:t xml:space="preserve">    /// &lt;summary&gt;</w:t>
-      </w:r>
-    </w:p>
-    <w:p>
-      <w:pPr>
-        <w:pStyle w:val="NoSpacing"/>
-        <w:rPr>
-          <w:rFonts w:ascii="Consolas" w:hAnsi="Consolas"/>
-          <w:sz w:val="19"/>
-        </w:rPr>
-      </w:pPr>
-      <w:r>
-        <w:rPr>
-          <w:rFonts w:ascii="Consolas" w:hAnsi="Consolas"/>
-          <w:sz w:val="19"/>
-        </w:rPr>
-        <w:t xml:space="preserve">    /// A preliminary agent responsible for taking a raw user input and converting it</w:t>
-      </w:r>
-    </w:p>
-    <w:p>
-      <w:pPr>
-        <w:pStyle w:val="NoSpacing"/>
-        <w:rPr>
-          <w:rFonts w:ascii="Consolas" w:hAnsi="Consolas"/>
-          <w:sz w:val="19"/>
-        </w:rPr>
-      </w:pPr>
-      <w:r>
-        <w:rPr>
-          <w:rFonts w:ascii="Consolas" w:hAnsi="Consolas"/>
-          <w:sz w:val="19"/>
-        </w:rPr>
-        <w:t xml:space="preserve">    /// into a professional, actionable project specification.</w:t>
-      </w:r>
-    </w:p>
-    <w:p>
-      <w:pPr>
-        <w:pStyle w:val="NoSpacing"/>
-        <w:rPr>
-          <w:rFonts w:ascii="Consolas" w:hAnsi="Consolas"/>
-          <w:sz w:val="19"/>
-        </w:rPr>
-      </w:pPr>
-      <w:r>
-        <w:rPr>
-          <w:rFonts w:ascii="Consolas" w:hAnsi="Consolas"/>
-          <w:sz w:val="19"/>
-        </w:rPr>
-        <w:t xml:space="preserve">    /// &lt;/summary&gt;</w:t>
-      </w:r>
-    </w:p>
-    <w:p>
-      <w:pPr>
-        <w:pStyle w:val="NoSpacing"/>
-        <w:rPr>
-          <w:rFonts w:ascii="Consolas" w:hAnsi="Consolas"/>
-          <w:sz w:val="19"/>
-        </w:rPr>
-      </w:pPr>
-      <w:r>
-        <w:rPr>
-          <w:rFonts w:ascii="Consolas" w:hAnsi="Consolas"/>
-          <w:sz w:val="19"/>
-        </w:rPr>
-        <w:t xml:space="preserve">    internal class GoalRefinerAgent : IProjectAgent</w:t>
+        <w:t xml:space="preserve">    internal class ProjectTask</w:t>
       </w:r>
     </w:p>
     <w:p>
@@ -1126,429 +2122,103 @@
           <w:rFonts w:ascii="Consolas" w:hAnsi="Consolas"/>
           <w:sz w:val="19"/>
         </w:rPr>
-        <w:t xml:space="preserve">        private readonly Kernel _kernel;</w:t>
-      </w:r>
-    </w:p>
-    <w:p>
-      <w:pPr>
-        <w:pStyle w:val="NoSpacing"/>
-        <w:rPr>
-          <w:rFonts w:ascii="Consolas" w:hAnsi="Consolas"/>
-          <w:sz w:val="19"/>
-        </w:rPr>
-      </w:pPr>
-      <w:r>
-        <w:rPr>
-          <w:rFonts w:ascii="Consolas" w:hAnsi="Consolas"/>
-          <w:sz w:val="19"/>
-        </w:rPr>
-        <w:t xml:space="preserve">        public string Name =&gt; "GoalRefiner";</w:t>
-      </w:r>
-    </w:p>
-    <w:p>
-      <w:pPr>
-        <w:pStyle w:val="NoSpacing"/>
-        <w:rPr>
-          <w:rFonts w:ascii="Consolas" w:hAnsi="Consolas"/>
-          <w:sz w:val="19"/>
-        </w:rPr>
-      </w:pPr>
-    </w:p>
-    <w:p>
-      <w:pPr>
-        <w:pStyle w:val="NoSpacing"/>
-        <w:rPr>
-          <w:rFonts w:ascii="Consolas" w:hAnsi="Consolas"/>
-          <w:sz w:val="19"/>
-        </w:rPr>
-      </w:pPr>
-      <w:r>
-        <w:rPr>
-          <w:rFonts w:ascii="Consolas" w:hAnsi="Consolas"/>
-          <w:sz w:val="19"/>
-        </w:rPr>
-        <w:t xml:space="preserve">        public GoalRefinerAgent(Kernel kernel)</w:t>
-      </w:r>
-    </w:p>
-    <w:p>
-      <w:pPr>
-        <w:pStyle w:val="NoSpacing"/>
-        <w:rPr>
-          <w:rFonts w:ascii="Consolas" w:hAnsi="Consolas"/>
-          <w:sz w:val="19"/>
-        </w:rPr>
-      </w:pPr>
-      <w:r>
-        <w:rPr>
-          <w:rFonts w:ascii="Consolas" w:hAnsi="Consolas"/>
-          <w:sz w:val="19"/>
-        </w:rPr>
-        <w:t xml:space="preserve">        {</w:t>
-      </w:r>
-    </w:p>
-    <w:p>
-      <w:pPr>
-        <w:pStyle w:val="NoSpacing"/>
-        <w:rPr>
-          <w:rFonts w:ascii="Consolas" w:hAnsi="Consolas"/>
-          <w:sz w:val="19"/>
-        </w:rPr>
-      </w:pPr>
-      <w:r>
-        <w:rPr>
-          <w:rFonts w:ascii="Consolas" w:hAnsi="Consolas"/>
-          <w:sz w:val="19"/>
-        </w:rPr>
-        <w:t xml:space="preserve">            _kernel = kernel;</w:t>
-      </w:r>
-    </w:p>
-    <w:p>
-      <w:pPr>
-        <w:pStyle w:val="NoSpacing"/>
-        <w:rPr>
-          <w:rFonts w:ascii="Consolas" w:hAnsi="Consolas"/>
-          <w:sz w:val="19"/>
-        </w:rPr>
-      </w:pPr>
-      <w:r>
-        <w:rPr>
-          <w:rFonts w:ascii="Consolas" w:hAnsi="Consolas"/>
-          <w:sz w:val="19"/>
-        </w:rPr>
-        <w:t xml:space="preserve">        }</w:t>
-      </w:r>
-    </w:p>
-    <w:p>
-      <w:pPr>
-        <w:pStyle w:val="NoSpacing"/>
-        <w:rPr>
-          <w:rFonts w:ascii="Consolas" w:hAnsi="Consolas"/>
-          <w:sz w:val="19"/>
-        </w:rPr>
-      </w:pPr>
-    </w:p>
-    <w:p>
-      <w:pPr>
-        <w:pStyle w:val="NoSpacing"/>
-        <w:rPr>
-          <w:rFonts w:ascii="Consolas" w:hAnsi="Consolas"/>
-          <w:sz w:val="19"/>
-        </w:rPr>
-      </w:pPr>
-      <w:r>
-        <w:rPr>
-          <w:rFonts w:ascii="Consolas" w:hAnsi="Consolas"/>
-          <w:sz w:val="19"/>
-        </w:rPr>
-        <w:t xml:space="preserve">        public async Task ExecuteAsync(ProjectState state)</w:t>
-      </w:r>
-    </w:p>
-    <w:p>
-      <w:pPr>
-        <w:pStyle w:val="NoSpacing"/>
-        <w:rPr>
-          <w:rFonts w:ascii="Consolas" w:hAnsi="Consolas"/>
-          <w:sz w:val="19"/>
-        </w:rPr>
-      </w:pPr>
-      <w:r>
-        <w:rPr>
-          <w:rFonts w:ascii="Consolas" w:hAnsi="Consolas"/>
-          <w:sz w:val="19"/>
-        </w:rPr>
-        <w:t xml:space="preserve">        {</w:t>
-      </w:r>
-    </w:p>
-    <w:p>
-      <w:pPr>
-        <w:pStyle w:val="NoSpacing"/>
-        <w:rPr>
-          <w:rFonts w:ascii="Consolas" w:hAnsi="Consolas"/>
-          <w:sz w:val="19"/>
-        </w:rPr>
-      </w:pPr>
-      <w:r>
-        <w:rPr>
-          <w:rFonts w:ascii="Consolas" w:hAnsi="Consolas"/>
-          <w:sz w:val="19"/>
-        </w:rPr>
-        <w:t xml:space="preserve">            // Use the kernel to refine the goal based on the original request</w:t>
-      </w:r>
-    </w:p>
-    <w:p>
-      <w:pPr>
-        <w:pStyle w:val="NoSpacing"/>
-        <w:rPr>
-          <w:rFonts w:ascii="Consolas" w:hAnsi="Consolas"/>
-          <w:sz w:val="19"/>
-        </w:rPr>
-      </w:pPr>
-      <w:r>
-        <w:rPr>
-          <w:rFonts w:ascii="Consolas" w:hAnsi="Consolas"/>
-          <w:sz w:val="19"/>
-        </w:rPr>
-        <w:t xml:space="preserve">            var prompt = $@"</w:t>
-      </w:r>
-    </w:p>
-    <w:p>
-      <w:pPr>
-        <w:pStyle w:val="NoSpacing"/>
-        <w:rPr>
-          <w:rFonts w:ascii="Consolas" w:hAnsi="Consolas"/>
-          <w:sz w:val="19"/>
-        </w:rPr>
-      </w:pPr>
-      <w:r>
-        <w:rPr>
-          <w:rFonts w:ascii="Consolas" w:hAnsi="Consolas"/>
-          <w:sz w:val="19"/>
-        </w:rPr>
-        <w:t xml:space="preserve">                You are a highly analytical Project Manager.</w:t>
-      </w:r>
-    </w:p>
-    <w:p>
-      <w:pPr>
-        <w:pStyle w:val="NoSpacing"/>
-        <w:rPr>
-          <w:rFonts w:ascii="Consolas" w:hAnsi="Consolas"/>
-          <w:sz w:val="19"/>
-        </w:rPr>
-      </w:pPr>
-      <w:r>
-        <w:rPr>
-          <w:rFonts w:ascii="Consolas" w:hAnsi="Consolas"/>
-          <w:sz w:val="19"/>
-        </w:rPr>
-        <w:t xml:space="preserve">                Take the user's raw request and refine it into a clear, 1-sentence technical goal.</w:t>
-      </w:r>
-    </w:p>
-    <w:p>
-      <w:pPr>
-        <w:pStyle w:val="NoSpacing"/>
-        <w:rPr>
-          <w:rFonts w:ascii="Consolas" w:hAnsi="Consolas"/>
-          <w:sz w:val="19"/>
-        </w:rPr>
-      </w:pPr>
-      <w:r>
-        <w:rPr>
-          <w:rFonts w:ascii="Consolas" w:hAnsi="Consolas"/>
-          <w:sz w:val="19"/>
-        </w:rPr>
-        <w:t xml:space="preserve">                Strip away conversational filler.</w:t>
-      </w:r>
-    </w:p>
-    <w:p>
-      <w:pPr>
-        <w:pStyle w:val="NoSpacing"/>
-        <w:rPr>
-          <w:rFonts w:ascii="Consolas" w:hAnsi="Consolas"/>
-          <w:sz w:val="19"/>
-        </w:rPr>
-      </w:pPr>
-    </w:p>
-    <w:p>
-      <w:pPr>
-        <w:pStyle w:val="NoSpacing"/>
-        <w:rPr>
-          <w:rFonts w:ascii="Consolas" w:hAnsi="Consolas"/>
-          <w:sz w:val="19"/>
-        </w:rPr>
-      </w:pPr>
-      <w:r>
-        <w:rPr>
-          <w:rFonts w:ascii="Consolas" w:hAnsi="Consolas"/>
-          <w:sz w:val="19"/>
-        </w:rPr>
-        <w:t xml:space="preserve">                RAW REQUEST: {state.OriginalRequest}</w:t>
-      </w:r>
-    </w:p>
-    <w:p>
-      <w:pPr>
-        <w:pStyle w:val="NoSpacing"/>
-        <w:rPr>
-          <w:rFonts w:ascii="Consolas" w:hAnsi="Consolas"/>
-          <w:sz w:val="19"/>
-        </w:rPr>
-      </w:pPr>
-      <w:r>
-        <w:rPr>
-          <w:rFonts w:ascii="Consolas" w:hAnsi="Consolas"/>
-          <w:sz w:val="19"/>
-        </w:rPr>
-        <w:t xml:space="preserve">                ".Trim();</w:t>
-      </w:r>
-    </w:p>
-    <w:p>
-      <w:pPr>
-        <w:pStyle w:val="NoSpacing"/>
-        <w:rPr>
-          <w:rFonts w:ascii="Consolas" w:hAnsi="Consolas"/>
-          <w:sz w:val="19"/>
-        </w:rPr>
-      </w:pPr>
-    </w:p>
-    <w:p>
-      <w:pPr>
-        <w:pStyle w:val="NoSpacing"/>
-        <w:rPr>
-          <w:rFonts w:ascii="Consolas" w:hAnsi="Consolas"/>
-          <w:sz w:val="19"/>
-        </w:rPr>
-      </w:pPr>
-      <w:r>
-        <w:rPr>
-          <w:rFonts w:ascii="Consolas" w:hAnsi="Consolas"/>
-          <w:sz w:val="19"/>
-        </w:rPr>
-        <w:t xml:space="preserve">            // Execute the prompt with a low temperature to ensure deterministic and professional output</w:t>
-      </w:r>
-    </w:p>
-    <w:p>
-      <w:pPr>
-        <w:pStyle w:val="NoSpacing"/>
-        <w:rPr>
-          <w:rFonts w:ascii="Consolas" w:hAnsi="Consolas"/>
-          <w:sz w:val="19"/>
-        </w:rPr>
-      </w:pPr>
-      <w:r>
-        <w:rPr>
-          <w:rFonts w:ascii="Consolas" w:hAnsi="Consolas"/>
-          <w:sz w:val="19"/>
-        </w:rPr>
-        <w:t xml:space="preserve">            var settings = new GeminiPromptExecutionSettings</w:t>
-      </w:r>
-    </w:p>
-    <w:p>
-      <w:pPr>
-        <w:pStyle w:val="NoSpacing"/>
-        <w:rPr>
-          <w:rFonts w:ascii="Consolas" w:hAnsi="Consolas"/>
-          <w:sz w:val="19"/>
-        </w:rPr>
-      </w:pPr>
-      <w:r>
-        <w:rPr>
-          <w:rFonts w:ascii="Consolas" w:hAnsi="Consolas"/>
-          <w:sz w:val="19"/>
-        </w:rPr>
-        <w:t xml:space="preserve">            {</w:t>
-      </w:r>
-    </w:p>
-    <w:p>
-      <w:pPr>
-        <w:pStyle w:val="NoSpacing"/>
-        <w:rPr>
-          <w:rFonts w:ascii="Consolas" w:hAnsi="Consolas"/>
-          <w:sz w:val="19"/>
-        </w:rPr>
-      </w:pPr>
-      <w:r>
-        <w:rPr>
-          <w:rFonts w:ascii="Consolas" w:hAnsi="Consolas"/>
-          <w:sz w:val="19"/>
-        </w:rPr>
-        <w:t xml:space="preserve">                Temperature = 0.1</w:t>
-      </w:r>
-    </w:p>
-    <w:p>
-      <w:pPr>
-        <w:pStyle w:val="NoSpacing"/>
-        <w:rPr>
-          <w:rFonts w:ascii="Consolas" w:hAnsi="Consolas"/>
-          <w:sz w:val="19"/>
-        </w:rPr>
-      </w:pPr>
-      <w:r>
-        <w:rPr>
-          <w:rFonts w:ascii="Consolas" w:hAnsi="Consolas"/>
-          <w:sz w:val="19"/>
-        </w:rPr>
-        <w:t xml:space="preserve">            };</w:t>
-      </w:r>
-    </w:p>
-    <w:p>
-      <w:pPr>
-        <w:pStyle w:val="NoSpacing"/>
-        <w:rPr>
-          <w:rFonts w:ascii="Consolas" w:hAnsi="Consolas"/>
-          <w:sz w:val="19"/>
-        </w:rPr>
-      </w:pPr>
-    </w:p>
-    <w:p>
-      <w:pPr>
-        <w:pStyle w:val="NoSpacing"/>
-        <w:rPr>
-          <w:rFonts w:ascii="Consolas" w:hAnsi="Consolas"/>
-          <w:sz w:val="19"/>
-        </w:rPr>
-      </w:pPr>
-      <w:r>
-        <w:rPr>
-          <w:rFonts w:ascii="Consolas" w:hAnsi="Consolas"/>
-          <w:sz w:val="19"/>
-        </w:rPr>
-        <w:t xml:space="preserve">            var result = await _kernel.InvokePromptAsync(prompt, new KernelArguments(settings));</w:t>
-      </w:r>
-    </w:p>
-    <w:p>
-      <w:pPr>
-        <w:pStyle w:val="NoSpacing"/>
-        <w:rPr>
-          <w:rFonts w:ascii="Consolas" w:hAnsi="Consolas"/>
-          <w:sz w:val="19"/>
-        </w:rPr>
-      </w:pPr>
-    </w:p>
-    <w:p>
-      <w:pPr>
-        <w:pStyle w:val="NoSpacing"/>
-        <w:rPr>
-          <w:rFonts w:ascii="Consolas" w:hAnsi="Consolas"/>
-          <w:sz w:val="19"/>
-        </w:rPr>
-      </w:pPr>
-      <w:r>
-        <w:rPr>
-          <w:rFonts w:ascii="Consolas" w:hAnsi="Consolas"/>
-          <w:sz w:val="19"/>
-        </w:rPr>
-        <w:t xml:space="preserve">            // Mutate the shared state with the refined goal</w:t>
-      </w:r>
-    </w:p>
-    <w:p>
-      <w:pPr>
-        <w:pStyle w:val="NoSpacing"/>
-        <w:rPr>
-          <w:rFonts w:ascii="Consolas" w:hAnsi="Consolas"/>
-          <w:sz w:val="19"/>
-        </w:rPr>
-      </w:pPr>
-      <w:r>
-        <w:rPr>
-          <w:rFonts w:ascii="Consolas" w:hAnsi="Consolas"/>
-          <w:sz w:val="19"/>
-        </w:rPr>
-        <w:t xml:space="preserve">            state.RefinedGoal = result.ToString().Trim();</w:t>
-      </w:r>
-    </w:p>
-    <w:p>
-      <w:pPr>
-        <w:pStyle w:val="NoSpacing"/>
-        <w:rPr>
-          <w:rFonts w:ascii="Consolas" w:hAnsi="Consolas"/>
-          <w:sz w:val="19"/>
-        </w:rPr>
-      </w:pPr>
-      <w:r>
-        <w:rPr>
-          <w:rFonts w:ascii="Consolas" w:hAnsi="Consolas"/>
-          <w:sz w:val="19"/>
-        </w:rPr>
-        <w:t xml:space="preserve">        }</w:t>
+        <w:t xml:space="preserve">        public string Id { get; set;  } = Guid.NewGuid().ToString("N").Substring(0,8);</w:t>
+      </w:r>
+    </w:p>
+    <w:p>
+      <w:pPr>
+        <w:pStyle w:val="NoSpacing"/>
+        <w:rPr>
+          <w:rFonts w:ascii="Consolas" w:hAnsi="Consolas"/>
+          <w:sz w:val="19"/>
+        </w:rPr>
+      </w:pPr>
+      <w:r>
+        <w:rPr>
+          <w:rFonts w:ascii="Consolas" w:hAnsi="Consolas"/>
+          <w:sz w:val="19"/>
+        </w:rPr>
+        <w:t xml:space="preserve">        public string Description { get; set; } = string.Empty;</w:t>
+      </w:r>
+    </w:p>
+    <w:p>
+      <w:pPr>
+        <w:pStyle w:val="NoSpacing"/>
+        <w:rPr>
+          <w:rFonts w:ascii="Consolas" w:hAnsi="Consolas"/>
+          <w:sz w:val="19"/>
+        </w:rPr>
+      </w:pPr>
+      <w:r>
+        <w:rPr>
+          <w:rFonts w:ascii="Consolas" w:hAnsi="Consolas"/>
+          <w:sz w:val="19"/>
+        </w:rPr>
+        <w:t xml:space="preserve">        public string AssignedTo { get; set; } = string.Empty; // e.g., "Developer", "Reviewer"</w:t>
+      </w:r>
+    </w:p>
+    <w:p>
+      <w:pPr>
+        <w:pStyle w:val="NoSpacing"/>
+        <w:rPr>
+          <w:rFonts w:ascii="Consolas" w:hAnsi="Consolas"/>
+          <w:sz w:val="19"/>
+        </w:rPr>
+      </w:pPr>
+      <w:r>
+        <w:rPr>
+          <w:rFonts w:ascii="Consolas" w:hAnsi="Consolas"/>
+          <w:sz w:val="19"/>
+        </w:rPr>
+        <w:t xml:space="preserve">        // Step: default to string.Empty like the other string properties above,</w:t>
+      </w:r>
+    </w:p>
+    <w:p>
+      <w:pPr>
+        <w:pStyle w:val="NoSpacing"/>
+        <w:rPr>
+          <w:rFonts w:ascii="Consolas" w:hAnsi="Consolas"/>
+          <w:sz w:val="19"/>
+        </w:rPr>
+      </w:pPr>
+      <w:r>
+        <w:rPr>
+          <w:rFonts w:ascii="Consolas" w:hAnsi="Consolas"/>
+          <w:sz w:val="19"/>
+        </w:rPr>
+        <w:t xml:space="preserve">        // so a task that hasn't produced output yet is never null under nullable reference types.</w:t>
+      </w:r>
+    </w:p>
+    <w:p>
+      <w:pPr>
+        <w:pStyle w:val="NoSpacing"/>
+        <w:rPr>
+          <w:rFonts w:ascii="Consolas" w:hAnsi="Consolas"/>
+          <w:sz w:val="19"/>
+        </w:rPr>
+      </w:pPr>
+      <w:r>
+        <w:rPr>
+          <w:rFonts w:ascii="Consolas" w:hAnsi="Consolas"/>
+          <w:sz w:val="19"/>
+        </w:rPr>
+        <w:t xml:space="preserve">        public string Result { get; set; } = string.Empty;</w:t>
+      </w:r>
+    </w:p>
+    <w:p>
+      <w:pPr>
+        <w:pStyle w:val="NoSpacing"/>
+        <w:rPr>
+          <w:rFonts w:ascii="Consolas" w:hAnsi="Consolas"/>
+          <w:sz w:val="19"/>
+        </w:rPr>
+      </w:pPr>
+      <w:r>
+        <w:rPr>
+          <w:rFonts w:ascii="Consolas" w:hAnsi="Consolas"/>
+          <w:sz w:val="19"/>
+        </w:rPr>
+        <w:t xml:space="preserve">        public bool IsCompleted { get; set; } = false;</w:t>
       </w:r>
     </w:p>
     <w:p>
@@ -1583,556 +2253,45 @@
         <w:t>}</w:t>
       </w:r>
     </w:p>
-    <w:p>
-      <w:pPr>
+    <w:p/>
+    <w:p>
+      <w:pPr>
+        <w:pStyle w:val="Heading2"/>
+      </w:pPr>
+      <w:r>
+        <w:t>5. Code Walkthrough &amp; Explanations</w:t>
+      </w:r>
+    </w:p>
+    <w:p>
+      <w:r>
         <w:rPr>
           <w:b/>
         </w:rPr>
-      </w:pPr>
+        <w:t>Step 1: Why a shared state object instead of passing strings.</w:t>
+      </w:r>
+      <w:r>
+        <w:t xml:space="preserve"> Every previous lesson in this course passed conversational context around as a `ChatHistory` or a plain string. The capstone abandons that as soon as multiple specialized agents need to collaborate. `ProjectState` is introduced as the "blackboard" — a single object that holds everything the system currently knows: the user's raw ask (`OriginalRequest`), the cleaned-up technical goal (`RefinedGoal`), and the evolving list of work items (`Tasks`). Every agent from here forward will take a `ProjectState` in and mutate it in place, rather than returning a value that has to be manually threaded to the next step. This is the single most important architectural decision of the capstone, and Day 27 exists specifically to introduce it before any agent logic gets layered on top.</w:t>
+      </w:r>
+    </w:p>
+    <w:p/>
+    <w:p>
       <w:r>
         <w:rPr>
           <w:b/>
         </w:rPr>
-        <w:t>ProjectState.cs</w:t>
-      </w:r>
-    </w:p>
-    <w:p>
-      <w:pPr>
-        <w:pStyle w:val="NoSpacing"/>
-        <w:rPr>
-          <w:rFonts w:ascii="Consolas" w:hAnsi="Consolas"/>
-          <w:sz w:val="19"/>
-        </w:rPr>
-      </w:pPr>
-      <w:r>
-        <w:rPr>
-          <w:rFonts w:ascii="Consolas" w:hAnsi="Consolas"/>
-          <w:sz w:val="19"/>
-        </w:rPr>
-        <w:t>namespace UniversalProjectManager</w:t>
-      </w:r>
-    </w:p>
-    <w:p>
-      <w:pPr>
-        <w:pStyle w:val="NoSpacing"/>
-        <w:rPr>
-          <w:rFonts w:ascii="Consolas" w:hAnsi="Consolas"/>
-          <w:sz w:val="19"/>
-        </w:rPr>
-      </w:pPr>
-      <w:r>
-        <w:rPr>
-          <w:rFonts w:ascii="Consolas" w:hAnsi="Consolas"/>
-          <w:sz w:val="19"/>
-        </w:rPr>
-        <w:t>{</w:t>
-      </w:r>
-    </w:p>
-    <w:p>
-      <w:pPr>
-        <w:pStyle w:val="NoSpacing"/>
-        <w:rPr>
-          <w:rFonts w:ascii="Consolas" w:hAnsi="Consolas"/>
-          <w:sz w:val="19"/>
-        </w:rPr>
-      </w:pPr>
-      <w:r>
-        <w:rPr>
-          <w:rFonts w:ascii="Consolas" w:hAnsi="Consolas"/>
-          <w:sz w:val="19"/>
-        </w:rPr>
-        <w:t xml:space="preserve">    internal class ProjectState</w:t>
-      </w:r>
-    </w:p>
-    <w:p>
-      <w:pPr>
-        <w:pStyle w:val="NoSpacing"/>
-        <w:rPr>
-          <w:rFonts w:ascii="Consolas" w:hAnsi="Consolas"/>
-          <w:sz w:val="19"/>
-        </w:rPr>
-      </w:pPr>
-      <w:r>
-        <w:rPr>
-          <w:rFonts w:ascii="Consolas" w:hAnsi="Consolas"/>
-          <w:sz w:val="19"/>
-        </w:rPr>
-        <w:t xml:space="preserve">    {</w:t>
-      </w:r>
-    </w:p>
-    <w:p>
-      <w:pPr>
-        <w:pStyle w:val="NoSpacing"/>
-        <w:rPr>
-          <w:rFonts w:ascii="Consolas" w:hAnsi="Consolas"/>
-          <w:sz w:val="19"/>
-        </w:rPr>
-      </w:pPr>
-      <w:r>
-        <w:rPr>
-          <w:rFonts w:ascii="Consolas" w:hAnsi="Consolas"/>
-          <w:sz w:val="19"/>
-        </w:rPr>
-        <w:t xml:space="preserve">        public string OriginalRequest { get; set; } =string.Empty;</w:t>
-      </w:r>
-    </w:p>
-    <w:p>
-      <w:pPr>
-        <w:pStyle w:val="NoSpacing"/>
-        <w:rPr>
-          <w:rFonts w:ascii="Consolas" w:hAnsi="Consolas"/>
-          <w:sz w:val="19"/>
-        </w:rPr>
-      </w:pPr>
-      <w:r>
-        <w:rPr>
-          <w:rFonts w:ascii="Consolas" w:hAnsi="Consolas"/>
-          <w:sz w:val="19"/>
-        </w:rPr>
-        <w:t xml:space="preserve">        public string RefinedGoal { get; set; } = string.Empty;</w:t>
-      </w:r>
-    </w:p>
-    <w:p>
-      <w:pPr>
-        <w:pStyle w:val="NoSpacing"/>
-        <w:rPr>
-          <w:rFonts w:ascii="Consolas" w:hAnsi="Consolas"/>
-          <w:sz w:val="19"/>
-        </w:rPr>
-      </w:pPr>
-      <w:r>
-        <w:rPr>
-          <w:rFonts w:ascii="Consolas" w:hAnsi="Consolas"/>
-          <w:sz w:val="19"/>
-        </w:rPr>
-        <w:t xml:space="preserve">        public List&lt;ProjectTask&gt; Tasks { get; set; } = new List&lt;ProjectTask&gt;();</w:t>
-      </w:r>
-    </w:p>
-    <w:p>
-      <w:pPr>
-        <w:pStyle w:val="NoSpacing"/>
-        <w:rPr>
-          <w:rFonts w:ascii="Consolas" w:hAnsi="Consolas"/>
-          <w:sz w:val="19"/>
-        </w:rPr>
-      </w:pPr>
-      <w:r>
-        <w:rPr>
-          <w:rFonts w:ascii="Consolas" w:hAnsi="Consolas"/>
-          <w:sz w:val="19"/>
-        </w:rPr>
-        <w:t xml:space="preserve">        public bool IsFullyCompleted =&gt; Tasks.Any() &amp;&amp; Tasks.All(t =&gt; t.IsCompleted);</w:t>
-      </w:r>
-    </w:p>
-    <w:p>
-      <w:pPr>
-        <w:pStyle w:val="NoSpacing"/>
-        <w:rPr>
-          <w:rFonts w:ascii="Consolas" w:hAnsi="Consolas"/>
-          <w:sz w:val="19"/>
-        </w:rPr>
-      </w:pPr>
-      <w:r>
-        <w:rPr>
-          <w:rFonts w:ascii="Consolas" w:hAnsi="Consolas"/>
-          <w:sz w:val="19"/>
-        </w:rPr>
-        <w:t xml:space="preserve">    }</w:t>
-      </w:r>
-    </w:p>
-    <w:p>
-      <w:pPr>
-        <w:pStyle w:val="NoSpacing"/>
-        <w:rPr>
-          <w:rFonts w:ascii="Consolas" w:hAnsi="Consolas"/>
-          <w:sz w:val="19"/>
-        </w:rPr>
-      </w:pPr>
-      <w:r>
-        <w:rPr>
-          <w:rFonts w:ascii="Consolas" w:hAnsi="Consolas"/>
-          <w:sz w:val="19"/>
-        </w:rPr>
-        <w:t>}</w:t>
-      </w:r>
-    </w:p>
-    <w:p>
-      <w:pPr>
+        <w:t>Step 2: `ProjectTask` — the atomic unit of work.</w:t>
+      </w:r>
+      <w:r>
+        <w:t xml:space="preserve"> `ProjectTask` is a plain data class: an auto-generated short `Id` (an 8-character slice of a GUID, just enough to be human-referenceable in console output), a `Description`, an `AssignedTo` role string, a `Result` string for whatever output gets produced, and an `IsCompleted` flag. Nothing in this file talks to Semantic Kernel at all — it's pure data modeling, which is deliberate: before you can have agents cooperate, you need an unambiguous, serializable shape for the thing they're cooperating over.</w:t>
+      </w:r>
+    </w:p>
+    <w:p/>
+    <w:p>
+      <w:r>
         <w:rPr>
           <w:b/>
         </w:rPr>
-      </w:pPr>
-      <w:r>
-        <w:rPr>
-          <w:b/>
-        </w:rPr>
-        <w:t>IProjectAgent.cs</w:t>
-      </w:r>
-    </w:p>
-    <w:p>
-      <w:pPr>
-        <w:pStyle w:val="NoSpacing"/>
-        <w:rPr>
-          <w:rFonts w:ascii="Consolas" w:hAnsi="Consolas"/>
-          <w:sz w:val="19"/>
-        </w:rPr>
-      </w:pPr>
-      <w:r>
-        <w:rPr>
-          <w:rFonts w:ascii="Consolas" w:hAnsi="Consolas"/>
-          <w:sz w:val="19"/>
-        </w:rPr>
-        <w:t>namespace UniversalProjectManager</w:t>
-      </w:r>
-    </w:p>
-    <w:p>
-      <w:pPr>
-        <w:pStyle w:val="NoSpacing"/>
-        <w:rPr>
-          <w:rFonts w:ascii="Consolas" w:hAnsi="Consolas"/>
-          <w:sz w:val="19"/>
-        </w:rPr>
-      </w:pPr>
-      <w:r>
-        <w:rPr>
-          <w:rFonts w:ascii="Consolas" w:hAnsi="Consolas"/>
-          <w:sz w:val="19"/>
-        </w:rPr>
-        <w:t>{</w:t>
-      </w:r>
-    </w:p>
-    <w:p>
-      <w:pPr>
-        <w:pStyle w:val="NoSpacing"/>
-        <w:rPr>
-          <w:rFonts w:ascii="Consolas" w:hAnsi="Consolas"/>
-          <w:sz w:val="19"/>
-        </w:rPr>
-      </w:pPr>
-      <w:r>
-        <w:rPr>
-          <w:rFonts w:ascii="Consolas" w:hAnsi="Consolas"/>
-          <w:sz w:val="19"/>
-        </w:rPr>
-        <w:t xml:space="preserve">    internal interface IProjectAgent</w:t>
-      </w:r>
-    </w:p>
-    <w:p>
-      <w:pPr>
-        <w:pStyle w:val="NoSpacing"/>
-        <w:rPr>
-          <w:rFonts w:ascii="Consolas" w:hAnsi="Consolas"/>
-          <w:sz w:val="19"/>
-        </w:rPr>
-      </w:pPr>
-      <w:r>
-        <w:rPr>
-          <w:rFonts w:ascii="Consolas" w:hAnsi="Consolas"/>
-          <w:sz w:val="19"/>
-        </w:rPr>
-        <w:t xml:space="preserve">    {</w:t>
-      </w:r>
-    </w:p>
-    <w:p>
-      <w:pPr>
-        <w:pStyle w:val="NoSpacing"/>
-        <w:rPr>
-          <w:rFonts w:ascii="Consolas" w:hAnsi="Consolas"/>
-          <w:sz w:val="19"/>
-        </w:rPr>
-      </w:pPr>
-      <w:r>
-        <w:rPr>
-          <w:rFonts w:ascii="Consolas" w:hAnsi="Consolas"/>
-          <w:sz w:val="19"/>
-        </w:rPr>
-        <w:t xml:space="preserve">        string Name { get; }</w:t>
-      </w:r>
-    </w:p>
-    <w:p>
-      <w:pPr>
-        <w:pStyle w:val="NoSpacing"/>
-        <w:rPr>
-          <w:rFonts w:ascii="Consolas" w:hAnsi="Consolas"/>
-          <w:sz w:val="19"/>
-        </w:rPr>
-      </w:pPr>
-    </w:p>
-    <w:p>
-      <w:pPr>
-        <w:pStyle w:val="NoSpacing"/>
-        <w:rPr>
-          <w:rFonts w:ascii="Consolas" w:hAnsi="Consolas"/>
-          <w:sz w:val="19"/>
-        </w:rPr>
-      </w:pPr>
-      <w:r>
-        <w:rPr>
-          <w:rFonts w:ascii="Consolas" w:hAnsi="Consolas"/>
-          <w:sz w:val="19"/>
-        </w:rPr>
-        <w:t xml:space="preserve">        Task ExecuteAsync(ProjectState state);</w:t>
-      </w:r>
-    </w:p>
-    <w:p>
-      <w:pPr>
-        <w:pStyle w:val="NoSpacing"/>
-        <w:rPr>
-          <w:rFonts w:ascii="Consolas" w:hAnsi="Consolas"/>
-          <w:sz w:val="19"/>
-        </w:rPr>
-      </w:pPr>
-      <w:r>
-        <w:rPr>
-          <w:rFonts w:ascii="Consolas" w:hAnsi="Consolas"/>
-          <w:sz w:val="19"/>
-        </w:rPr>
-        <w:t xml:space="preserve">    }</w:t>
-      </w:r>
-    </w:p>
-    <w:p>
-      <w:pPr>
-        <w:pStyle w:val="NoSpacing"/>
-        <w:rPr>
-          <w:rFonts w:ascii="Consolas" w:hAnsi="Consolas"/>
-          <w:sz w:val="19"/>
-        </w:rPr>
-      </w:pPr>
-      <w:r>
-        <w:rPr>
-          <w:rFonts w:ascii="Consolas" w:hAnsi="Consolas"/>
-          <w:sz w:val="19"/>
-        </w:rPr>
-        <w:t>}</w:t>
-      </w:r>
-    </w:p>
-    <w:p>
-      <w:pPr>
-        <w:rPr>
-          <w:b/>
-        </w:rPr>
-      </w:pPr>
-      <w:r>
-        <w:rPr>
-          <w:b/>
-        </w:rPr>
-        <w:t>ProjectTask.cs</w:t>
-      </w:r>
-    </w:p>
-    <w:p>
-      <w:pPr>
-        <w:pStyle w:val="NoSpacing"/>
-        <w:rPr>
-          <w:rFonts w:ascii="Consolas" w:hAnsi="Consolas"/>
-          <w:sz w:val="19"/>
-        </w:rPr>
-      </w:pPr>
-      <w:r>
-        <w:rPr>
-          <w:rFonts w:ascii="Consolas" w:hAnsi="Consolas"/>
-          <w:sz w:val="19"/>
-        </w:rPr>
-        <w:t>namespace UniversalProjectManager</w:t>
-      </w:r>
-    </w:p>
-    <w:p>
-      <w:pPr>
-        <w:pStyle w:val="NoSpacing"/>
-        <w:rPr>
-          <w:rFonts w:ascii="Consolas" w:hAnsi="Consolas"/>
-          <w:sz w:val="19"/>
-        </w:rPr>
-      </w:pPr>
-      <w:r>
-        <w:rPr>
-          <w:rFonts w:ascii="Consolas" w:hAnsi="Consolas"/>
-          <w:sz w:val="19"/>
-        </w:rPr>
-        <w:t>{</w:t>
-      </w:r>
-    </w:p>
-    <w:p>
-      <w:pPr>
-        <w:pStyle w:val="NoSpacing"/>
-        <w:rPr>
-          <w:rFonts w:ascii="Consolas" w:hAnsi="Consolas"/>
-          <w:sz w:val="19"/>
-        </w:rPr>
-      </w:pPr>
-      <w:r>
-        <w:rPr>
-          <w:rFonts w:ascii="Consolas" w:hAnsi="Consolas"/>
-          <w:sz w:val="19"/>
-        </w:rPr>
-        <w:t xml:space="preserve">    internal class ProjectTask</w:t>
-      </w:r>
-    </w:p>
-    <w:p>
-      <w:pPr>
-        <w:pStyle w:val="NoSpacing"/>
-        <w:rPr>
-          <w:rFonts w:ascii="Consolas" w:hAnsi="Consolas"/>
-          <w:sz w:val="19"/>
-        </w:rPr>
-      </w:pPr>
-      <w:r>
-        <w:rPr>
-          <w:rFonts w:ascii="Consolas" w:hAnsi="Consolas"/>
-          <w:sz w:val="19"/>
-        </w:rPr>
-        <w:t xml:space="preserve">    {</w:t>
-      </w:r>
-    </w:p>
-    <w:p>
-      <w:pPr>
-        <w:pStyle w:val="NoSpacing"/>
-        <w:rPr>
-          <w:rFonts w:ascii="Consolas" w:hAnsi="Consolas"/>
-          <w:sz w:val="19"/>
-        </w:rPr>
-      </w:pPr>
-      <w:r>
-        <w:rPr>
-          <w:rFonts w:ascii="Consolas" w:hAnsi="Consolas"/>
-          <w:sz w:val="19"/>
-        </w:rPr>
-        <w:t xml:space="preserve">        public string Id { get; set;  } = Guid.NewGuid().ToString("N").Substring(0,8);</w:t>
-      </w:r>
-    </w:p>
-    <w:p>
-      <w:pPr>
-        <w:pStyle w:val="NoSpacing"/>
-        <w:rPr>
-          <w:rFonts w:ascii="Consolas" w:hAnsi="Consolas"/>
-          <w:sz w:val="19"/>
-        </w:rPr>
-      </w:pPr>
-      <w:r>
-        <w:rPr>
-          <w:rFonts w:ascii="Consolas" w:hAnsi="Consolas"/>
-          <w:sz w:val="19"/>
-        </w:rPr>
-        <w:t xml:space="preserve">        public string Description { get; set; } = string.Empty;</w:t>
-      </w:r>
-    </w:p>
-    <w:p>
-      <w:pPr>
-        <w:pStyle w:val="NoSpacing"/>
-        <w:rPr>
-          <w:rFonts w:ascii="Consolas" w:hAnsi="Consolas"/>
-          <w:sz w:val="19"/>
-        </w:rPr>
-      </w:pPr>
-      <w:r>
-        <w:rPr>
-          <w:rFonts w:ascii="Consolas" w:hAnsi="Consolas"/>
-          <w:sz w:val="19"/>
-        </w:rPr>
-        <w:t xml:space="preserve">        public string AssignedTo { get; set; } = string.Empty; // e.g., "Developer", "Reviewer"</w:t>
-      </w:r>
-    </w:p>
-    <w:p>
-      <w:pPr>
-        <w:pStyle w:val="NoSpacing"/>
-        <w:rPr>
-          <w:rFonts w:ascii="Consolas" w:hAnsi="Consolas"/>
-          <w:sz w:val="19"/>
-        </w:rPr>
-      </w:pPr>
-      <w:r>
-        <w:rPr>
-          <w:rFonts w:ascii="Consolas" w:hAnsi="Consolas"/>
-          <w:sz w:val="19"/>
-        </w:rPr>
-        <w:t xml:space="preserve">        public string Result { get; set; }</w:t>
-      </w:r>
-    </w:p>
-    <w:p>
-      <w:pPr>
-        <w:pStyle w:val="NoSpacing"/>
-        <w:rPr>
-          <w:rFonts w:ascii="Consolas" w:hAnsi="Consolas"/>
-          <w:sz w:val="19"/>
-        </w:rPr>
-      </w:pPr>
-      <w:r>
-        <w:rPr>
-          <w:rFonts w:ascii="Consolas" w:hAnsi="Consolas"/>
-          <w:sz w:val="19"/>
-        </w:rPr>
-        <w:t xml:space="preserve">        public bool IsCompleted { get; set; } = false;</w:t>
-      </w:r>
-    </w:p>
-    <w:p>
-      <w:pPr>
-        <w:pStyle w:val="NoSpacing"/>
-        <w:rPr>
-          <w:rFonts w:ascii="Consolas" w:hAnsi="Consolas"/>
-          <w:sz w:val="19"/>
-        </w:rPr>
-      </w:pPr>
-      <w:r>
-        <w:rPr>
-          <w:rFonts w:ascii="Consolas" w:hAnsi="Consolas"/>
-          <w:sz w:val="19"/>
-        </w:rPr>
-        <w:t xml:space="preserve">    }</w:t>
-      </w:r>
-    </w:p>
-    <w:p>
-      <w:pPr>
-        <w:pStyle w:val="NoSpacing"/>
-        <w:rPr>
-          <w:rFonts w:ascii="Consolas" w:hAnsi="Consolas"/>
-          <w:sz w:val="19"/>
-        </w:rPr>
-      </w:pPr>
-      <w:r>
-        <w:rPr>
-          <w:rFonts w:ascii="Consolas" w:hAnsi="Consolas"/>
-          <w:sz w:val="19"/>
-        </w:rPr>
-        <w:t>}</w:t>
-      </w:r>
-    </w:p>
-    <w:p/>
-    <w:p>
-      <w:pPr>
-        <w:pStyle w:val="Heading2"/>
-      </w:pPr>
-      <w:r>
-        <w:t>5. Code Walkthrough &amp; Explanations</w:t>
-      </w:r>
-    </w:p>
-    <w:p>
-      <w:r>
-        <w:rPr>
-          <w:b/>
-        </w:rPr>
-        <w:t>Step 1: Why a shared state object instead of passing strings.</w:t>
-      </w:r>
-      <w:r>
-        <w:t xml:space="preserve"> Every previous lesson in this course passed conversational context around as a `ChatHistory` or a plain string. The capstone abandons that as soon as multiple specialized agents need to collaborate. `ProjectState` is introduced as the "blackboard" — a single object that holds everything the system currently knows: the user's raw ask (`OriginalRequest`), the cleaned-up technical goal (`RefinedGoal`), and the evolving list of work items (`Tasks`). Every agent from here forward will take a `ProjectState` in and mutate it in place, rather than returning a value that has to be manually threaded to the next step. This is the single most important architectural decision of the capstone, and Day 27 exists specifically to introduce it before any agent logic gets layered on top.</w:t>
-      </w:r>
-    </w:p>
-    <w:p/>
-    <w:p>
-      <w:r>
-        <w:rPr>
-          <w:b/>
-        </w:rPr>
-        <w:t>Step 2: `ProjectTask` — the atomic unit of work.</w:t>
-      </w:r>
-      <w:r>
-        <w:t xml:space="preserve"> `ProjectTask` is a plain data class: an auto-generated short `Id` (an 8-character slice of a GUID, just enough to be human-referenceable in console output), a `Description`, an `AssignedTo` role string, a `Result` string for whatever output gets produced, and an `IsCompleted` flag. Nothing in this file talks to Semantic Kernel at all — it's pure data modeling, which is deliberate: before you can have agents cooperate, you need an unambiguous, serializable shape for the thing they're cooperating over.</w:t>
-      </w:r>
-    </w:p>
-    <w:p/>
-    <w:p>
-      <w:r>
-        <w:rPr>
-          <w:b/>
-        </w:rPr>
+        <w:lastRenderedPageBreak/>
         <w:t>Step 3: `IProjectAgent` — the contract every future agent obeys.</w:t>
       </w:r>
       <w:r>

</xml_diff>